<commit_message>
portfolio v.1.1.1: MAJ portfolio.json index.html
</commit_message>
<xml_diff>
--- a/portfolio.docx
+++ b/portfolio.docx
@@ -843,6 +843,7 @@
             <w:br w:type="page"/>
           </w:r>
         </w:p>
+        <w:bookmarkStart w:id="0" w:name="_Toc238527932" w:displacedByCustomXml="next"/>
         <w:sdt>
           <w:sdtPr>
             <w:rPr>
@@ -883,6 +884,7 @@
                 </w:rPr>
                 <w:t>Sommaire</w:t>
               </w:r>
+              <w:bookmarkEnd w:id="0"/>
             </w:p>
             <w:p>
               <w:pPr>
@@ -890,15 +892,14 @@
                 <w:tabs>
                   <w:tab w:val="right" w:leader="dot" w:pos="9016"/>
                 </w:tabs>
-                <w:jc w:val="both"/>
                 <w:rPr>
                   <w:rFonts w:eastAsiaTheme="minorEastAsia"/>
                   <w:b w:val="0"/>
                   <w:bCs w:val="0"/>
                   <w:caps w:val="0"/>
                   <w:noProof/>
-                  <w:sz w:val="22"/>
-                  <w:szCs w:val="22"/>
+                  <w:sz w:val="24"/>
+                  <w:szCs w:val="24"/>
                   <w:lang w:eastAsia="en-GB"/>
                 </w:rPr>
               </w:pPr>
@@ -927,23 +928,18 @@
                 </w:rPr>
                 <w:fldChar w:fldCharType="separate"/>
               </w:r>
-              <w:hyperlink w:anchor="_Toc238269135" w:history="1">
+              <w:hyperlink w:anchor="_Toc238527932" w:history="1">
                 <w:r>
                   <w:rPr>
                     <w:rStyle w:val="Hyperlink"/>
                     <w:noProof/>
-                    <w:sz w:val="18"/>
-                    <w:szCs w:val="18"/>
-                    <w:lang w:val="fr-FR"/>
                   </w:rPr>
-                  <w:t>A - Projet : agent d’accueil à CHSA</w:t>
+                  <w:t>Sommaire</w:t>
                 </w:r>
                 <w:r>
                   <w:rPr>
                     <w:noProof/>
                     <w:webHidden/>
-                    <w:sz w:val="18"/>
-                    <w:szCs w:val="18"/>
                   </w:rPr>
                   <w:tab/>
                 </w:r>
@@ -951,8 +947,6 @@
                   <w:rPr>
                     <w:noProof/>
                     <w:webHidden/>
-                    <w:sz w:val="18"/>
-                    <w:szCs w:val="18"/>
                   </w:rPr>
                   <w:fldChar w:fldCharType="begin"/>
                 </w:r>
@@ -960,25 +954,19 @@
                   <w:rPr>
                     <w:noProof/>
                     <w:webHidden/>
-                    <w:sz w:val="18"/>
-                    <w:szCs w:val="18"/>
                   </w:rPr>
-                  <w:instrText xml:space="preserve"> PAGEREF _Toc238269135 \h </w:instrText>
+                  <w:instrText xml:space="preserve"> PAGEREF _Toc238527932 \h </w:instrText>
                 </w:r>
                 <w:r>
                   <w:rPr>
                     <w:noProof/>
                     <w:webHidden/>
-                    <w:sz w:val="18"/>
-                    <w:szCs w:val="18"/>
                   </w:rPr>
                 </w:r>
                 <w:r>
                   <w:rPr>
                     <w:noProof/>
                     <w:webHidden/>
-                    <w:sz w:val="18"/>
-                    <w:szCs w:val="18"/>
                   </w:rPr>
                   <w:fldChar w:fldCharType="separate"/>
                 </w:r>
@@ -986,8 +974,83 @@
                   <w:rPr>
                     <w:noProof/>
                     <w:webHidden/>
-                    <w:sz w:val="18"/>
-                    <w:szCs w:val="18"/>
+                  </w:rPr>
+                  <w:t>1</w:t>
+                </w:r>
+                <w:r>
+                  <w:rPr>
+                    <w:noProof/>
+                    <w:webHidden/>
+                  </w:rPr>
+                  <w:fldChar w:fldCharType="end"/>
+                </w:r>
+              </w:hyperlink>
+            </w:p>
+            <w:p>
+              <w:pPr>
+                <w:pStyle w:val="TOC1"/>
+                <w:tabs>
+                  <w:tab w:val="right" w:leader="dot" w:pos="9016"/>
+                </w:tabs>
+                <w:rPr>
+                  <w:rFonts w:eastAsiaTheme="minorEastAsia"/>
+                  <w:b w:val="0"/>
+                  <w:bCs w:val="0"/>
+                  <w:caps w:val="0"/>
+                  <w:noProof/>
+                  <w:sz w:val="24"/>
+                  <w:szCs w:val="24"/>
+                  <w:lang w:eastAsia="en-GB"/>
+                </w:rPr>
+              </w:pPr>
+              <w:hyperlink w:anchor="_Toc238527933" w:history="1">
+                <w:r>
+                  <w:rPr>
+                    <w:rStyle w:val="Hyperlink"/>
+                    <w:rFonts w:ascii="Arial" w:hAnsi="Arial"/>
+                    <w:noProof/>
+                    <w:lang w:val="fr-FR"/>
+                  </w:rPr>
+                  <w:t>Executive summary</w:t>
+                </w:r>
+                <w:r>
+                  <w:rPr>
+                    <w:noProof/>
+                    <w:webHidden/>
+                  </w:rPr>
+                  <w:tab/>
+                </w:r>
+                <w:r>
+                  <w:rPr>
+                    <w:noProof/>
+                    <w:webHidden/>
+                  </w:rPr>
+                  <w:fldChar w:fldCharType="begin"/>
+                </w:r>
+                <w:r>
+                  <w:rPr>
+                    <w:noProof/>
+                    <w:webHidden/>
+                  </w:rPr>
+                  <w:instrText xml:space="preserve"> PAGEREF _Toc238527933 \h </w:instrText>
+                </w:r>
+                <w:r>
+                  <w:rPr>
+                    <w:noProof/>
+                    <w:webHidden/>
+                  </w:rPr>
+                </w:r>
+                <w:r>
+                  <w:rPr>
+                    <w:noProof/>
+                    <w:webHidden/>
+                  </w:rPr>
+                  <w:fldChar w:fldCharType="separate"/>
+                </w:r>
+                <w:r>
+                  <w:rPr>
+                    <w:noProof/>
+                    <w:webHidden/>
                   </w:rPr>
                   <w:t>3</w:t>
                 </w:r>
@@ -995,8 +1058,235 @@
                   <w:rPr>
                     <w:noProof/>
                     <w:webHidden/>
-                    <w:sz w:val="18"/>
-                    <w:szCs w:val="18"/>
+                  </w:rPr>
+                  <w:fldChar w:fldCharType="end"/>
+                </w:r>
+              </w:hyperlink>
+            </w:p>
+            <w:p>
+              <w:pPr>
+                <w:pStyle w:val="TOC1"/>
+                <w:tabs>
+                  <w:tab w:val="right" w:leader="dot" w:pos="9016"/>
+                </w:tabs>
+                <w:rPr>
+                  <w:rFonts w:eastAsiaTheme="minorEastAsia"/>
+                  <w:b w:val="0"/>
+                  <w:bCs w:val="0"/>
+                  <w:caps w:val="0"/>
+                  <w:noProof/>
+                  <w:sz w:val="24"/>
+                  <w:szCs w:val="24"/>
+                  <w:lang w:eastAsia="en-GB"/>
+                </w:rPr>
+              </w:pPr>
+              <w:hyperlink w:anchor="_Toc238527934" w:history="1">
+                <w:r>
+                  <w:rPr>
+                    <w:rStyle w:val="Hyperlink"/>
+                    <w:rFonts w:ascii="Arial" w:hAnsi="Arial"/>
+                    <w:noProof/>
+                    <w:lang w:val="fr-FR"/>
+                  </w:rPr>
+                  <w:t>A – cas d’usage - projet technique : agent d’accueil et d’orientation au service d’urgence au Centre Hospitalier (fictif) SA</w:t>
+                </w:r>
+                <w:r>
+                  <w:rPr>
+                    <w:noProof/>
+                    <w:webHidden/>
+                  </w:rPr>
+                  <w:tab/>
+                </w:r>
+                <w:r>
+                  <w:rPr>
+                    <w:noProof/>
+                    <w:webHidden/>
+                  </w:rPr>
+                  <w:fldChar w:fldCharType="begin"/>
+                </w:r>
+                <w:r>
+                  <w:rPr>
+                    <w:noProof/>
+                    <w:webHidden/>
+                  </w:rPr>
+                  <w:instrText xml:space="preserve"> PAGEREF _Toc238527934 \h </w:instrText>
+                </w:r>
+                <w:r>
+                  <w:rPr>
+                    <w:noProof/>
+                    <w:webHidden/>
+                  </w:rPr>
+                </w:r>
+                <w:r>
+                  <w:rPr>
+                    <w:noProof/>
+                    <w:webHidden/>
+                  </w:rPr>
+                  <w:fldChar w:fldCharType="separate"/>
+                </w:r>
+                <w:r>
+                  <w:rPr>
+                    <w:noProof/>
+                    <w:webHidden/>
+                  </w:rPr>
+                  <w:t>3</w:t>
+                </w:r>
+                <w:r>
+                  <w:rPr>
+                    <w:noProof/>
+                    <w:webHidden/>
+                  </w:rPr>
+                  <w:fldChar w:fldCharType="end"/>
+                </w:r>
+              </w:hyperlink>
+            </w:p>
+            <w:p>
+              <w:pPr>
+                <w:pStyle w:val="TOC2"/>
+                <w:tabs>
+                  <w:tab w:val="right" w:leader="dot" w:pos="9016"/>
+                </w:tabs>
+                <w:rPr>
+                  <w:rFonts w:eastAsiaTheme="minorEastAsia"/>
+                  <w:smallCaps w:val="0"/>
+                  <w:noProof/>
+                  <w:sz w:val="24"/>
+                  <w:szCs w:val="24"/>
+                  <w:lang w:eastAsia="en-GB"/>
+                </w:rPr>
+              </w:pPr>
+              <w:hyperlink w:anchor="_Toc238527935" w:history="1">
+                <w:r>
+                  <w:rPr>
+                    <w:rStyle w:val="Hyperlink"/>
+                    <w:rFonts w:ascii="Arial" w:hAnsi="Arial"/>
+                    <w:noProof/>
+                    <w:lang w:val="fr-FR"/>
+                  </w:rPr>
+                  <w:t>Actions menées au cours du projet</w:t>
+                </w:r>
+                <w:r>
+                  <w:rPr>
+                    <w:noProof/>
+                    <w:webHidden/>
+                  </w:rPr>
+                  <w:tab/>
+                </w:r>
+                <w:r>
+                  <w:rPr>
+                    <w:noProof/>
+                    <w:webHidden/>
+                  </w:rPr>
+                  <w:fldChar w:fldCharType="begin"/>
+                </w:r>
+                <w:r>
+                  <w:rPr>
+                    <w:noProof/>
+                    <w:webHidden/>
+                  </w:rPr>
+                  <w:instrText xml:space="preserve"> PAGEREF _Toc238527935 \h </w:instrText>
+                </w:r>
+                <w:r>
+                  <w:rPr>
+                    <w:noProof/>
+                    <w:webHidden/>
+                  </w:rPr>
+                </w:r>
+                <w:r>
+                  <w:rPr>
+                    <w:noProof/>
+                    <w:webHidden/>
+                  </w:rPr>
+                  <w:fldChar w:fldCharType="separate"/>
+                </w:r>
+                <w:r>
+                  <w:rPr>
+                    <w:noProof/>
+                    <w:webHidden/>
+                  </w:rPr>
+                  <w:t>3</w:t>
+                </w:r>
+                <w:r>
+                  <w:rPr>
+                    <w:noProof/>
+                    <w:webHidden/>
+                  </w:rPr>
+                  <w:fldChar w:fldCharType="end"/>
+                </w:r>
+              </w:hyperlink>
+            </w:p>
+            <w:p>
+              <w:pPr>
+                <w:pStyle w:val="TOC1"/>
+                <w:tabs>
+                  <w:tab w:val="right" w:leader="dot" w:pos="9016"/>
+                </w:tabs>
+                <w:rPr>
+                  <w:rFonts w:eastAsiaTheme="minorEastAsia"/>
+                  <w:b w:val="0"/>
+                  <w:bCs w:val="0"/>
+                  <w:caps w:val="0"/>
+                  <w:noProof/>
+                  <w:sz w:val="24"/>
+                  <w:szCs w:val="24"/>
+                  <w:lang w:eastAsia="en-GB"/>
+                </w:rPr>
+              </w:pPr>
+              <w:hyperlink w:anchor="_Toc238527936" w:history="1">
+                <w:r>
+                  <w:rPr>
+                    <w:rStyle w:val="Hyperlink"/>
+                    <w:rFonts w:ascii="Arial" w:hAnsi="Arial"/>
+                    <w:noProof/>
+                    <w:lang w:val="fr-FR"/>
+                  </w:rPr>
+                  <w:t>B - Compétences et projets additionnels</w:t>
+                </w:r>
+                <w:r>
+                  <w:rPr>
+                    <w:noProof/>
+                    <w:webHidden/>
+                  </w:rPr>
+                  <w:tab/>
+                </w:r>
+                <w:r>
+                  <w:rPr>
+                    <w:noProof/>
+                    <w:webHidden/>
+                  </w:rPr>
+                  <w:fldChar w:fldCharType="begin"/>
+                </w:r>
+                <w:r>
+                  <w:rPr>
+                    <w:noProof/>
+                    <w:webHidden/>
+                  </w:rPr>
+                  <w:instrText xml:space="preserve"> PAGEREF _Toc238527936 \h </w:instrText>
+                </w:r>
+                <w:r>
+                  <w:rPr>
+                    <w:noProof/>
+                    <w:webHidden/>
+                  </w:rPr>
+                </w:r>
+                <w:r>
+                  <w:rPr>
+                    <w:noProof/>
+                    <w:webHidden/>
+                  </w:rPr>
+                  <w:fldChar w:fldCharType="separate"/>
+                </w:r>
+                <w:r>
+                  <w:rPr>
+                    <w:noProof/>
+                    <w:webHidden/>
+                  </w:rPr>
+                  <w:t>6</w:t>
+                </w:r>
+                <w:r>
+                  <w:rPr>
+                    <w:noProof/>
+                    <w:webHidden/>
                   </w:rPr>
                   <w:fldChar w:fldCharType="end"/>
                 </w:r>
@@ -1008,34 +1298,41 @@
                 <w:tabs>
                   <w:tab w:val="right" w:leader="dot" w:pos="9016"/>
                 </w:tabs>
-                <w:jc w:val="both"/>
                 <w:rPr>
                   <w:rFonts w:eastAsiaTheme="minorEastAsia"/>
                   <w:i w:val="0"/>
                   <w:iCs w:val="0"/>
                   <w:noProof/>
-                  <w:sz w:val="22"/>
-                  <w:szCs w:val="22"/>
+                  <w:sz w:val="24"/>
+                  <w:szCs w:val="24"/>
                   <w:lang w:eastAsia="en-GB"/>
                 </w:rPr>
               </w:pPr>
-              <w:hyperlink w:anchor="_Toc238269136" w:history="1">
+              <w:hyperlink w:anchor="_Toc238527937" w:history="1">
                 <w:r>
                   <w:rPr>
                     <w:rStyle w:val="Hyperlink"/>
+                    <w:rFonts w:ascii="Arial" w:eastAsia="Times New Roman" w:hAnsi="Arial"/>
+                    <w:b/>
+                    <w:bCs/>
                     <w:noProof/>
-                    <w:sz w:val="18"/>
-                    <w:szCs w:val="18"/>
-                    <w:lang w:val="fr-FR"/>
+                    <w:lang w:eastAsia="en-GB"/>
                   </w:rPr>
-                  <w:t>Actions menées au cours du projet</w:t>
+                  <w:t xml:space="preserve">1 - </w:t>
+                </w:r>
+                <w:r>
+                  <w:rPr>
+                    <w:rStyle w:val="Hyperlink"/>
+                    <w:rFonts w:ascii="Arial" w:eastAsia="Times New Roman" w:hAnsi="Arial"/>
+                    <w:noProof/>
+                    <w:lang w:eastAsia="en-GB"/>
+                  </w:rPr>
+                  <w:t>Liste des compétences acquises et developpées</w:t>
                 </w:r>
                 <w:r>
                   <w:rPr>
                     <w:noProof/>
                     <w:webHidden/>
-                    <w:sz w:val="18"/>
-                    <w:szCs w:val="18"/>
                   </w:rPr>
                   <w:tab/>
                 </w:r>
@@ -1043,8 +1340,6 @@
                   <w:rPr>
                     <w:noProof/>
                     <w:webHidden/>
-                    <w:sz w:val="18"/>
-                    <w:szCs w:val="18"/>
                   </w:rPr>
                   <w:fldChar w:fldCharType="begin"/>
                 </w:r>
@@ -1052,25 +1347,19 @@
                   <w:rPr>
                     <w:noProof/>
                     <w:webHidden/>
-                    <w:sz w:val="18"/>
-                    <w:szCs w:val="18"/>
                   </w:rPr>
-                  <w:instrText xml:space="preserve"> PAGEREF _Toc238269136 \h </w:instrText>
+                  <w:instrText xml:space="preserve"> PAGEREF _Toc238527937 \h </w:instrText>
                 </w:r>
                 <w:r>
                   <w:rPr>
                     <w:noProof/>
                     <w:webHidden/>
-                    <w:sz w:val="18"/>
-                    <w:szCs w:val="18"/>
                   </w:rPr>
                 </w:r>
                 <w:r>
                   <w:rPr>
                     <w:noProof/>
                     <w:webHidden/>
-                    <w:sz w:val="18"/>
-                    <w:szCs w:val="18"/>
                   </w:rPr>
                   <w:fldChar w:fldCharType="separate"/>
                 </w:r>
@@ -1078,108 +1367,13 @@
                   <w:rPr>
                     <w:noProof/>
                     <w:webHidden/>
-                    <w:sz w:val="18"/>
-                    <w:szCs w:val="18"/>
                   </w:rPr>
-                  <w:t>3</w:t>
+                  <w:t>6</w:t>
                 </w:r>
                 <w:r>
                   <w:rPr>
                     <w:noProof/>
                     <w:webHidden/>
-                    <w:sz w:val="18"/>
-                    <w:szCs w:val="18"/>
-                  </w:rPr>
-                  <w:fldChar w:fldCharType="end"/>
-                </w:r>
-              </w:hyperlink>
-            </w:p>
-            <w:p>
-              <w:pPr>
-                <w:pStyle w:val="TOC2"/>
-                <w:tabs>
-                  <w:tab w:val="right" w:leader="dot" w:pos="9016"/>
-                </w:tabs>
-                <w:jc w:val="both"/>
-                <w:rPr>
-                  <w:rFonts w:eastAsiaTheme="minorEastAsia"/>
-                  <w:smallCaps w:val="0"/>
-                  <w:noProof/>
-                  <w:sz w:val="22"/>
-                  <w:szCs w:val="22"/>
-                  <w:lang w:eastAsia="en-GB"/>
-                </w:rPr>
-              </w:pPr>
-              <w:hyperlink w:anchor="_Toc238269137" w:history="1">
-                <w:r>
-                  <w:rPr>
-                    <w:rStyle w:val="Hyperlink"/>
-                    <w:noProof/>
-                    <w:sz w:val="18"/>
-                    <w:szCs w:val="18"/>
-                    <w:lang w:val="fr-FR"/>
-                  </w:rPr>
-                  <w:t>B - Compétences et projets additionnels</w:t>
-                </w:r>
-                <w:r>
-                  <w:rPr>
-                    <w:noProof/>
-                    <w:webHidden/>
-                    <w:sz w:val="18"/>
-                    <w:szCs w:val="18"/>
-                  </w:rPr>
-                  <w:tab/>
-                </w:r>
-                <w:r>
-                  <w:rPr>
-                    <w:noProof/>
-                    <w:webHidden/>
-                    <w:sz w:val="18"/>
-                    <w:szCs w:val="18"/>
-                  </w:rPr>
-                  <w:fldChar w:fldCharType="begin"/>
-                </w:r>
-                <w:r>
-                  <w:rPr>
-                    <w:noProof/>
-                    <w:webHidden/>
-                    <w:sz w:val="18"/>
-                    <w:szCs w:val="18"/>
-                  </w:rPr>
-                  <w:instrText xml:space="preserve"> PAGEREF _Toc238269137 \h </w:instrText>
-                </w:r>
-                <w:r>
-                  <w:rPr>
-                    <w:noProof/>
-                    <w:webHidden/>
-                    <w:sz w:val="18"/>
-                    <w:szCs w:val="18"/>
-                  </w:rPr>
-                </w:r>
-                <w:r>
-                  <w:rPr>
-                    <w:noProof/>
-                    <w:webHidden/>
-                    <w:sz w:val="18"/>
-                    <w:szCs w:val="18"/>
-                  </w:rPr>
-                  <w:fldChar w:fldCharType="separate"/>
-                </w:r>
-                <w:r>
-                  <w:rPr>
-                    <w:noProof/>
-                    <w:webHidden/>
-                    <w:sz w:val="18"/>
-                    <w:szCs w:val="18"/>
-                  </w:rPr>
-                  <w:t>5</w:t>
-                </w:r>
-                <w:r>
-                  <w:rPr>
-                    <w:noProof/>
-                    <w:webHidden/>
-                    <w:sz w:val="18"/>
-                    <w:szCs w:val="18"/>
                   </w:rPr>
                   <w:fldChar w:fldCharType="end"/>
                 </w:r>
@@ -1191,48 +1385,30 @@
                 <w:tabs>
                   <w:tab w:val="right" w:leader="dot" w:pos="9016"/>
                 </w:tabs>
-                <w:jc w:val="both"/>
                 <w:rPr>
                   <w:rFonts w:eastAsiaTheme="minorEastAsia"/>
                   <w:i w:val="0"/>
                   <w:iCs w:val="0"/>
                   <w:noProof/>
-                  <w:sz w:val="22"/>
-                  <w:szCs w:val="22"/>
+                  <w:sz w:val="24"/>
+                  <w:szCs w:val="24"/>
                   <w:lang w:eastAsia="en-GB"/>
                 </w:rPr>
               </w:pPr>
-              <w:hyperlink w:anchor="_Toc238269138" w:history="1">
+              <w:hyperlink w:anchor="_Toc238527938" w:history="1">
                 <w:r>
                   <w:rPr>
                     <w:rStyle w:val="Hyperlink"/>
-                    <w:rFonts w:eastAsia="Times New Roman"/>
-                    <w:b/>
-                    <w:bCs/>
+                    <w:rFonts w:ascii="Arial" w:eastAsia="Times New Roman" w:hAnsi="Arial"/>
                     <w:noProof/>
-                    <w:sz w:val="18"/>
-                    <w:szCs w:val="18"/>
                     <w:lang w:eastAsia="en-GB"/>
                   </w:rPr>
-                  <w:t xml:space="preserve">1 - </w:t>
-                </w:r>
-                <w:r>
-                  <w:rPr>
-                    <w:rStyle w:val="Hyperlink"/>
-                    <w:rFonts w:eastAsia="Times New Roman"/>
-                    <w:noProof/>
-                    <w:sz w:val="18"/>
-                    <w:szCs w:val="18"/>
-                    <w:lang w:eastAsia="en-GB"/>
-                  </w:rPr>
-                  <w:t>Liste des compétences acquises et developpées</w:t>
+                  <w:t>2 – Projets réalisés</w:t>
                 </w:r>
                 <w:r>
                   <w:rPr>
                     <w:noProof/>
                     <w:webHidden/>
-                    <w:sz w:val="18"/>
-                    <w:szCs w:val="18"/>
                   </w:rPr>
                   <w:tab/>
                 </w:r>
@@ -1240,8 +1416,6 @@
                   <w:rPr>
                     <w:noProof/>
                     <w:webHidden/>
-                    <w:sz w:val="18"/>
-                    <w:szCs w:val="18"/>
                   </w:rPr>
                   <w:fldChar w:fldCharType="begin"/>
                 </w:r>
@@ -1249,25 +1423,19 @@
                   <w:rPr>
                     <w:noProof/>
                     <w:webHidden/>
-                    <w:sz w:val="18"/>
-                    <w:szCs w:val="18"/>
                   </w:rPr>
-                  <w:instrText xml:space="preserve"> PAGEREF _Toc238269138 \h </w:instrText>
+                  <w:instrText xml:space="preserve"> PAGEREF _Toc238527938 \h </w:instrText>
                 </w:r>
                 <w:r>
                   <w:rPr>
                     <w:noProof/>
                     <w:webHidden/>
-                    <w:sz w:val="18"/>
-                    <w:szCs w:val="18"/>
                   </w:rPr>
                 </w:r>
                 <w:r>
                   <w:rPr>
                     <w:noProof/>
                     <w:webHidden/>
-                    <w:sz w:val="18"/>
-                    <w:szCs w:val="18"/>
                   </w:rPr>
                   <w:fldChar w:fldCharType="separate"/>
                 </w:r>
@@ -1275,17 +1443,13 @@
                   <w:rPr>
                     <w:noProof/>
                     <w:webHidden/>
-                    <w:sz w:val="18"/>
-                    <w:szCs w:val="18"/>
                   </w:rPr>
-                  <w:t>5</w:t>
+                  <w:t>6</w:t>
                 </w:r>
                 <w:r>
                   <w:rPr>
                     <w:noProof/>
                     <w:webHidden/>
-                    <w:sz w:val="18"/>
-                    <w:szCs w:val="18"/>
                   </w:rPr>
                   <w:fldChar w:fldCharType="end"/>
                 </w:r>
@@ -1297,35 +1461,54 @@
                 <w:tabs>
                   <w:tab w:val="right" w:leader="dot" w:pos="9016"/>
                 </w:tabs>
-                <w:jc w:val="both"/>
                 <w:rPr>
                   <w:rFonts w:eastAsiaTheme="minorEastAsia"/>
                   <w:i w:val="0"/>
                   <w:iCs w:val="0"/>
                   <w:noProof/>
-                  <w:sz w:val="22"/>
-                  <w:szCs w:val="22"/>
+                  <w:sz w:val="24"/>
+                  <w:szCs w:val="24"/>
                   <w:lang w:eastAsia="en-GB"/>
                 </w:rPr>
               </w:pPr>
-              <w:hyperlink w:anchor="_Toc238269139" w:history="1">
+              <w:hyperlink w:anchor="_Toc238527939" w:history="1">
                 <w:r>
                   <w:rPr>
                     <w:rStyle w:val="Hyperlink"/>
-                    <w:rFonts w:eastAsia="Times New Roman"/>
+                    <w:rFonts w:ascii="Arial" w:hAnsi="Arial"/>
                     <w:noProof/>
-                    <w:sz w:val="18"/>
-                    <w:szCs w:val="18"/>
                     <w:lang w:eastAsia="en-GB"/>
                   </w:rPr>
-                  <w:t>2 – Projets réalisés</w:t>
+                  <w:t>3 - Cas d’usage et démarche</w:t>
+                </w:r>
+                <w:r>
+                  <w:rPr>
+                    <w:rStyle w:val="Hyperlink"/>
+                    <w:rFonts w:ascii="Arial" w:eastAsia="Times New Roman" w:hAnsi="Arial" w:cs="Arial"/>
+                    <w:b/>
+                    <w:bCs/>
+                    <w:noProof/>
+                    <w:kern w:val="0"/>
+                    <w:lang w:eastAsia="en-GB"/>
+                    <w14:ligatures w14:val="none"/>
+                  </w:rPr>
+                  <w:t xml:space="preserve"> </w:t>
+                </w:r>
+                <w:r>
+                  <w:rPr>
+                    <w:rStyle w:val="Hyperlink"/>
+                    <w:rFonts w:ascii="Arial" w:eastAsia="Times New Roman" w:hAnsi="Arial" w:cs="Arial"/>
+                    <w:noProof/>
+                    <w:kern w:val="0"/>
+                    <w:lang w:eastAsia="en-GB"/>
+                    <w14:ligatures w14:val="none"/>
+                  </w:rPr>
+                  <w:t>:</w:t>
                 </w:r>
                 <w:r>
                   <w:rPr>
                     <w:noProof/>
                     <w:webHidden/>
-                    <w:sz w:val="18"/>
-                    <w:szCs w:val="18"/>
                   </w:rPr>
                   <w:tab/>
                 </w:r>
@@ -1333,8 +1516,6 @@
                   <w:rPr>
                     <w:noProof/>
                     <w:webHidden/>
-                    <w:sz w:val="18"/>
-                    <w:szCs w:val="18"/>
                   </w:rPr>
                   <w:fldChar w:fldCharType="begin"/>
                 </w:r>
@@ -1342,25 +1523,19 @@
                   <w:rPr>
                     <w:noProof/>
                     <w:webHidden/>
-                    <w:sz w:val="18"/>
-                    <w:szCs w:val="18"/>
                   </w:rPr>
-                  <w:instrText xml:space="preserve"> PAGEREF _Toc238269139 \h </w:instrText>
+                  <w:instrText xml:space="preserve"> PAGEREF _Toc238527939 \h </w:instrText>
                 </w:r>
                 <w:r>
                   <w:rPr>
                     <w:noProof/>
                     <w:webHidden/>
-                    <w:sz w:val="18"/>
-                    <w:szCs w:val="18"/>
                   </w:rPr>
                 </w:r>
                 <w:r>
                   <w:rPr>
                     <w:noProof/>
                     <w:webHidden/>
-                    <w:sz w:val="18"/>
-                    <w:szCs w:val="18"/>
                   </w:rPr>
                   <w:fldChar w:fldCharType="separate"/>
                 </w:r>
@@ -1368,17 +1543,13 @@
                   <w:rPr>
                     <w:noProof/>
                     <w:webHidden/>
-                    <w:sz w:val="18"/>
-                    <w:szCs w:val="18"/>
                   </w:rPr>
-                  <w:t>5</w:t>
+                  <w:t>9</w:t>
                 </w:r>
                 <w:r>
                   <w:rPr>
                     <w:noProof/>
                     <w:webHidden/>
-                    <w:sz w:val="18"/>
-                    <w:szCs w:val="18"/>
                   </w:rPr>
                   <w:fldChar w:fldCharType="end"/>
                 </w:r>
@@ -1390,152 +1561,22 @@
                 <w:tabs>
                   <w:tab w:val="right" w:leader="dot" w:pos="9016"/>
                 </w:tabs>
-                <w:jc w:val="both"/>
                 <w:rPr>
                   <w:rFonts w:eastAsiaTheme="minorEastAsia"/>
                   <w:i w:val="0"/>
                   <w:iCs w:val="0"/>
                   <w:noProof/>
-                  <w:sz w:val="22"/>
-                  <w:szCs w:val="22"/>
+                  <w:sz w:val="24"/>
+                  <w:szCs w:val="24"/>
                   <w:lang w:eastAsia="en-GB"/>
                 </w:rPr>
               </w:pPr>
-              <w:hyperlink w:anchor="_Toc238269140" w:history="1">
+              <w:hyperlink w:anchor="_Toc238527940" w:history="1">
                 <w:r>
                   <w:rPr>
                     <w:rStyle w:val="Hyperlink"/>
+                    <w:rFonts w:ascii="Arial" w:eastAsia="Times New Roman" w:hAnsi="Arial"/>
                     <w:noProof/>
-                    <w:sz w:val="18"/>
-                    <w:szCs w:val="18"/>
-                    <w:lang w:eastAsia="en-GB"/>
-                  </w:rPr>
-                  <w:t>3 - Cas d’usage et démarc</w:t>
-                </w:r>
-                <w:r>
-                  <w:rPr>
-                    <w:rStyle w:val="Hyperlink"/>
-                    <w:noProof/>
-                    <w:sz w:val="18"/>
-                    <w:szCs w:val="18"/>
-                    <w:lang w:eastAsia="en-GB"/>
-                  </w:rPr>
-                  <w:t>h</w:t>
-                </w:r>
-                <w:r>
-                  <w:rPr>
-                    <w:rStyle w:val="Hyperlink"/>
-                    <w:noProof/>
-                    <w:sz w:val="18"/>
-                    <w:szCs w:val="18"/>
-                    <w:lang w:eastAsia="en-GB"/>
-                  </w:rPr>
-                  <w:t>e</w:t>
-                </w:r>
-                <w:r>
-                  <w:rPr>
-                    <w:rStyle w:val="Hyperlink"/>
-                    <w:rFonts w:ascii="Arial" w:eastAsia="Times New Roman" w:hAnsi="Arial" w:cs="Arial"/>
-                    <w:b/>
-                    <w:bCs/>
-                    <w:noProof/>
-                    <w:kern w:val="0"/>
-                    <w:sz w:val="18"/>
-                    <w:szCs w:val="18"/>
-                    <w:lang w:eastAsia="en-GB"/>
-                    <w14:ligatures w14:val="none"/>
-                  </w:rPr>
-                  <w:t xml:space="preserve"> : POC</w:t>
-                </w:r>
-                <w:r>
-                  <w:rPr>
-                    <w:noProof/>
-                    <w:webHidden/>
-                    <w:sz w:val="18"/>
-                    <w:szCs w:val="18"/>
-                  </w:rPr>
-                  <w:tab/>
-                </w:r>
-                <w:r>
-                  <w:rPr>
-                    <w:noProof/>
-                    <w:webHidden/>
-                    <w:sz w:val="18"/>
-                    <w:szCs w:val="18"/>
-                  </w:rPr>
-                  <w:fldChar w:fldCharType="begin"/>
-                </w:r>
-                <w:r>
-                  <w:rPr>
-                    <w:noProof/>
-                    <w:webHidden/>
-                    <w:sz w:val="18"/>
-                    <w:szCs w:val="18"/>
-                  </w:rPr>
-                  <w:instrText xml:space="preserve"> PAGEREF _Toc238269140 \h </w:instrText>
-                </w:r>
-                <w:r>
-                  <w:rPr>
-                    <w:noProof/>
-                    <w:webHidden/>
-                    <w:sz w:val="18"/>
-                    <w:szCs w:val="18"/>
-                  </w:rPr>
-                </w:r>
-                <w:r>
-                  <w:rPr>
-                    <w:noProof/>
-                    <w:webHidden/>
-                    <w:sz w:val="18"/>
-                    <w:szCs w:val="18"/>
-                  </w:rPr>
-                  <w:fldChar w:fldCharType="separate"/>
-                </w:r>
-                <w:r>
-                  <w:rPr>
-                    <w:noProof/>
-                    <w:webHidden/>
-                    <w:sz w:val="18"/>
-                    <w:szCs w:val="18"/>
-                  </w:rPr>
-                  <w:t>7</w:t>
-                </w:r>
-                <w:r>
-                  <w:rPr>
-                    <w:noProof/>
-                    <w:webHidden/>
-                    <w:sz w:val="18"/>
-                    <w:szCs w:val="18"/>
-                  </w:rPr>
-                  <w:fldChar w:fldCharType="end"/>
-                </w:r>
-              </w:hyperlink>
-            </w:p>
-            <w:p>
-              <w:pPr>
-                <w:pStyle w:val="TOC3"/>
-                <w:tabs>
-                  <w:tab w:val="right" w:leader="dot" w:pos="9016"/>
-                </w:tabs>
-                <w:jc w:val="both"/>
-                <w:rPr>
-                  <w:rFonts w:eastAsiaTheme="minorEastAsia"/>
-                  <w:i w:val="0"/>
-                  <w:iCs w:val="0"/>
-                  <w:noProof/>
-                  <w:sz w:val="22"/>
-                  <w:szCs w:val="22"/>
-                  <w:lang w:eastAsia="en-GB"/>
-                </w:rPr>
-              </w:pPr>
-              <w:hyperlink w:anchor="_Toc238269141" w:history="1">
-                <w:r>
-                  <w:rPr>
-                    <w:rStyle w:val="Hyperlink"/>
-                    <w:rFonts w:eastAsia="Times New Roman"/>
-                    <w:noProof/>
-                    <w:sz w:val="18"/>
-                    <w:szCs w:val="18"/>
                     <w:lang w:eastAsia="en-GB"/>
                   </w:rPr>
                   <w:t>4 - soft skills</w:t>
@@ -1544,8 +1585,6 @@
                   <w:rPr>
                     <w:noProof/>
                     <w:webHidden/>
-                    <w:sz w:val="18"/>
-                    <w:szCs w:val="18"/>
                   </w:rPr>
                   <w:tab/>
                 </w:r>
@@ -1553,8 +1592,6 @@
                   <w:rPr>
                     <w:noProof/>
                     <w:webHidden/>
-                    <w:sz w:val="18"/>
-                    <w:szCs w:val="18"/>
                   </w:rPr>
                   <w:fldChar w:fldCharType="begin"/>
                 </w:r>
@@ -1562,25 +1599,19 @@
                   <w:rPr>
                     <w:noProof/>
                     <w:webHidden/>
-                    <w:sz w:val="18"/>
-                    <w:szCs w:val="18"/>
                   </w:rPr>
-                  <w:instrText xml:space="preserve"> PAGEREF _Toc238269141 \h </w:instrText>
+                  <w:instrText xml:space="preserve"> PAGEREF _Toc238527940 \h </w:instrText>
                 </w:r>
                 <w:r>
                   <w:rPr>
                     <w:noProof/>
                     <w:webHidden/>
-                    <w:sz w:val="18"/>
-                    <w:szCs w:val="18"/>
                   </w:rPr>
                 </w:r>
                 <w:r>
                   <w:rPr>
                     <w:noProof/>
                     <w:webHidden/>
-                    <w:sz w:val="18"/>
-                    <w:szCs w:val="18"/>
                   </w:rPr>
                   <w:fldChar w:fldCharType="separate"/>
                 </w:r>
@@ -1588,17 +1619,13 @@
                   <w:rPr>
                     <w:noProof/>
                     <w:webHidden/>
-                    <w:sz w:val="18"/>
-                    <w:szCs w:val="18"/>
                   </w:rPr>
-                  <w:t>8</w:t>
+                  <w:t>11</w:t>
                 </w:r>
                 <w:r>
                   <w:rPr>
                     <w:noProof/>
                     <w:webHidden/>
-                    <w:sz w:val="18"/>
-                    <w:szCs w:val="18"/>
                   </w:rPr>
                   <w:fldChar w:fldCharType="end"/>
                 </w:r>
@@ -1606,38 +1633,34 @@
             </w:p>
             <w:p>
               <w:pPr>
-                <w:pStyle w:val="TOC2"/>
+                <w:pStyle w:val="TOC1"/>
                 <w:tabs>
                   <w:tab w:val="right" w:leader="dot" w:pos="9016"/>
                 </w:tabs>
-                <w:jc w:val="both"/>
                 <w:rPr>
                   <w:rFonts w:eastAsiaTheme="minorEastAsia"/>
-                  <w:smallCaps w:val="0"/>
+                  <w:b w:val="0"/>
+                  <w:bCs w:val="0"/>
+                  <w:caps w:val="0"/>
                   <w:noProof/>
-                  <w:sz w:val="22"/>
-                  <w:szCs w:val="22"/>
+                  <w:sz w:val="24"/>
+                  <w:szCs w:val="24"/>
                   <w:lang w:eastAsia="en-GB"/>
                 </w:rPr>
               </w:pPr>
-              <w:hyperlink w:anchor="_Toc238269142" w:history="1">
+              <w:hyperlink w:anchor="_Toc238527941" w:history="1">
                 <w:r>
                   <w:rPr>
                     <w:rStyle w:val="Hyperlink"/>
-                    <w:rFonts w:eastAsia="Times New Roman"/>
+                    <w:rFonts w:ascii="Arial" w:hAnsi="Arial"/>
                     <w:noProof/>
-                    <w:sz w:val="18"/>
-                    <w:szCs w:val="18"/>
-                    <w:lang w:eastAsia="en-GB"/>
                   </w:rPr>
-                  <w:t>C - Carte mentale de notre formation</w:t>
+                  <w:t>D - Engagement Éthique et Conformité</w:t>
                 </w:r>
                 <w:r>
                   <w:rPr>
                     <w:noProof/>
                     <w:webHidden/>
-                    <w:sz w:val="18"/>
-                    <w:szCs w:val="18"/>
                   </w:rPr>
                   <w:tab/>
                 </w:r>
@@ -1645,8 +1668,6 @@
                   <w:rPr>
                     <w:noProof/>
                     <w:webHidden/>
-                    <w:sz w:val="18"/>
-                    <w:szCs w:val="18"/>
                   </w:rPr>
                   <w:fldChar w:fldCharType="begin"/>
                 </w:r>
@@ -1654,25 +1675,19 @@
                   <w:rPr>
                     <w:noProof/>
                     <w:webHidden/>
-                    <w:sz w:val="18"/>
-                    <w:szCs w:val="18"/>
                   </w:rPr>
-                  <w:instrText xml:space="preserve"> PAGEREF _Toc238269142 \h </w:instrText>
+                  <w:instrText xml:space="preserve"> PAGEREF _Toc238527941 \h </w:instrText>
                 </w:r>
                 <w:r>
                   <w:rPr>
                     <w:noProof/>
                     <w:webHidden/>
-                    <w:sz w:val="18"/>
-                    <w:szCs w:val="18"/>
                   </w:rPr>
                 </w:r>
                 <w:r>
                   <w:rPr>
                     <w:noProof/>
                     <w:webHidden/>
-                    <w:sz w:val="18"/>
-                    <w:szCs w:val="18"/>
                   </w:rPr>
                   <w:fldChar w:fldCharType="separate"/>
                 </w:r>
@@ -1680,17 +1695,88 @@
                   <w:rPr>
                     <w:noProof/>
                     <w:webHidden/>
-                    <w:sz w:val="18"/>
-                    <w:szCs w:val="18"/>
                   </w:rPr>
-                  <w:t>10</w:t>
+                  <w:t>13</w:t>
                 </w:r>
                 <w:r>
                   <w:rPr>
                     <w:noProof/>
                     <w:webHidden/>
-                    <w:sz w:val="18"/>
-                    <w:szCs w:val="18"/>
+                  </w:rPr>
+                  <w:fldChar w:fldCharType="end"/>
+                </w:r>
+              </w:hyperlink>
+            </w:p>
+            <w:p>
+              <w:pPr>
+                <w:pStyle w:val="TOC1"/>
+                <w:tabs>
+                  <w:tab w:val="right" w:leader="dot" w:pos="9016"/>
+                </w:tabs>
+                <w:rPr>
+                  <w:rFonts w:eastAsiaTheme="minorEastAsia"/>
+                  <w:b w:val="0"/>
+                  <w:bCs w:val="0"/>
+                  <w:caps w:val="0"/>
+                  <w:noProof/>
+                  <w:sz w:val="24"/>
+                  <w:szCs w:val="24"/>
+                  <w:lang w:eastAsia="en-GB"/>
+                </w:rPr>
+              </w:pPr>
+              <w:hyperlink w:anchor="_Toc238527942" w:history="1">
+                <w:r>
+                  <w:rPr>
+                    <w:rStyle w:val="Hyperlink"/>
+                    <w:noProof/>
+                  </w:rPr>
+                  <w:t>E – Conclusion</w:t>
+                </w:r>
+                <w:r>
+                  <w:rPr>
+                    <w:noProof/>
+                    <w:webHidden/>
+                  </w:rPr>
+                  <w:tab/>
+                </w:r>
+                <w:r>
+                  <w:rPr>
+                    <w:noProof/>
+                    <w:webHidden/>
+                  </w:rPr>
+                  <w:fldChar w:fldCharType="begin"/>
+                </w:r>
+                <w:r>
+                  <w:rPr>
+                    <w:noProof/>
+                    <w:webHidden/>
+                  </w:rPr>
+                  <w:instrText xml:space="preserve"> PAGEREF _Toc238527942 \h </w:instrText>
+                </w:r>
+                <w:r>
+                  <w:rPr>
+                    <w:noProof/>
+                    <w:webHidden/>
+                  </w:rPr>
+                </w:r>
+                <w:r>
+                  <w:rPr>
+                    <w:noProof/>
+                    <w:webHidden/>
+                  </w:rPr>
+                  <w:fldChar w:fldCharType="separate"/>
+                </w:r>
+                <w:r>
+                  <w:rPr>
+                    <w:noProof/>
+                    <w:webHidden/>
+                  </w:rPr>
+                  <w:t>13</w:t>
+                </w:r>
+                <w:r>
+                  <w:rPr>
+                    <w:noProof/>
+                    <w:webHidden/>
                   </w:rPr>
                   <w:fldChar w:fldCharType="end"/>
                 </w:r>
@@ -2148,13 +2234,14 @@
         <w:pStyle w:val="Heading1"/>
         <w:jc w:val="both"/>
         <w:rPr>
+          <w:rFonts w:ascii="Arial" w:hAnsi="Arial"/>
           <w:sz w:val="28"/>
           <w:szCs w:val="28"/>
           <w:u w:val="single"/>
           <w:lang w:val="fr-FR"/>
         </w:rPr>
       </w:pPr>
-      <w:bookmarkStart w:id="0" w:name="_Toc238269135"/>
+      <w:bookmarkStart w:id="1" w:name="_Toc238527933"/>
       <w:r>
         <w:rPr>
           <w:rFonts w:ascii="Arial" w:hAnsi="Arial"/>
@@ -2163,281 +2250,474 @@
           <w:u w:val="single"/>
           <w:lang w:val="fr-FR"/>
         </w:rPr>
-        <w:t xml:space="preserve">Executive summary </w:t>
-      </w:r>
-    </w:p>
-    <w:p>
-      <w:pPr>
-        <w:jc w:val="both"/>
-        <w:rPr>
-          <w:lang w:val="fr-FR"/>
-        </w:rPr>
-      </w:pPr>
-      <w:r>
-        <w:rPr>
-          <w:rFonts w:ascii="Arial" w:hAnsi="Arial"/>
-          <w:lang w:val="fr-FR"/>
-        </w:rPr>
-        <w:t>AI Engineer</w:t>
-      </w:r>
-      <w:r>
-        <w:rPr>
-          <w:rFonts w:ascii="Arial" w:hAnsi="Arial"/>
-          <w:lang w:val="fr-FR"/>
-        </w:rPr>
-        <w:t xml:space="preserve"> </w:t>
-      </w:r>
-      <w:r>
-        <w:rPr>
-          <w:rFonts w:ascii="Arial" w:hAnsi="Arial"/>
-          <w:lang w:val="fr-FR"/>
-        </w:rPr>
-        <w:t>focalisé sur la production, spécialisé dans l'industrialisation d'agents IA, expert</w:t>
-      </w:r>
-      <w:r>
-        <w:rPr>
-          <w:rFonts w:ascii="Arial" w:hAnsi="Arial"/>
-          <w:lang w:val="fr-FR"/>
-        </w:rPr>
-        <w:t xml:space="preserve"> </w:t>
-      </w:r>
-      <w:r>
-        <w:rPr>
-          <w:rFonts w:ascii="Arial" w:hAnsi="Arial"/>
-          <w:lang w:val="fr-FR"/>
-        </w:rPr>
-        <w:t>en architectures conteneurisées</w:t>
-      </w:r>
-    </w:p>
-    <w:p>
-      <w:pPr>
-        <w:pStyle w:val="Heading1"/>
-        <w:jc w:val="both"/>
-        <w:rPr>
-          <w:sz w:val="28"/>
-          <w:szCs w:val="28"/>
-          <w:lang w:val="fr-FR"/>
-        </w:rPr>
-      </w:pPr>
-      <w:r>
-        <w:rPr>
-          <w:rFonts w:ascii="Arial" w:hAnsi="Arial"/>
-          <w:sz w:val="28"/>
-          <w:szCs w:val="28"/>
-          <w:lang w:val="fr-FR"/>
-        </w:rPr>
-        <w:t xml:space="preserve">A </w:t>
-      </w:r>
-      <w:r>
-        <w:rPr>
-          <w:rFonts w:ascii="Arial" w:hAnsi="Arial"/>
-          <w:sz w:val="28"/>
-          <w:szCs w:val="28"/>
-          <w:lang w:val="fr-FR"/>
-        </w:rPr>
-        <w:t>–</w:t>
-      </w:r>
-      <w:r>
-        <w:rPr>
-          <w:rFonts w:ascii="Arial" w:hAnsi="Arial"/>
-          <w:sz w:val="28"/>
-          <w:szCs w:val="28"/>
-          <w:lang w:val="fr-FR"/>
-        </w:rPr>
-        <w:t xml:space="preserve"> </w:t>
-      </w:r>
-      <w:r>
-        <w:rPr>
-          <w:rFonts w:ascii="Arial" w:hAnsi="Arial"/>
-          <w:sz w:val="28"/>
-          <w:szCs w:val="28"/>
-          <w:lang w:val="fr-FR"/>
-        </w:rPr>
-        <w:t>cas d’usage</w:t>
-      </w:r>
-      <w:r>
-        <w:rPr>
-          <w:rFonts w:ascii="Arial" w:hAnsi="Arial"/>
-          <w:sz w:val="28"/>
-          <w:szCs w:val="28"/>
-          <w:lang w:val="fr-FR"/>
-        </w:rPr>
-        <w:t xml:space="preserve"> </w:t>
-      </w:r>
-      <w:r>
-        <w:rPr>
-          <w:rFonts w:ascii="Arial" w:hAnsi="Arial"/>
-          <w:sz w:val="28"/>
-          <w:szCs w:val="28"/>
-          <w:lang w:val="fr-FR"/>
-        </w:rPr>
-        <w:t>-</w:t>
-      </w:r>
-      <w:r>
-        <w:rPr>
-          <w:rFonts w:ascii="Arial" w:hAnsi="Arial"/>
-          <w:sz w:val="28"/>
-          <w:szCs w:val="28"/>
-          <w:lang w:val="fr-FR"/>
-        </w:rPr>
-        <w:t xml:space="preserve"> </w:t>
-      </w:r>
-      <w:r>
-        <w:rPr>
-          <w:rFonts w:ascii="Arial" w:hAnsi="Arial"/>
-          <w:sz w:val="28"/>
-          <w:szCs w:val="28"/>
-          <w:lang w:val="fr-FR"/>
-        </w:rPr>
-        <w:t>p</w:t>
-      </w:r>
-      <w:r>
-        <w:rPr>
-          <w:rFonts w:ascii="Arial" w:hAnsi="Arial"/>
-          <w:sz w:val="28"/>
-          <w:szCs w:val="28"/>
-          <w:lang w:val="fr-FR"/>
-        </w:rPr>
-        <w:t>rojet </w:t>
-      </w:r>
-      <w:r>
-        <w:rPr>
-          <w:rFonts w:ascii="Arial" w:hAnsi="Arial"/>
-          <w:sz w:val="28"/>
-          <w:szCs w:val="28"/>
-          <w:lang w:val="fr-FR"/>
-        </w:rPr>
-        <w:t xml:space="preserve">technique </w:t>
-      </w:r>
-      <w:r>
-        <w:rPr>
-          <w:rFonts w:ascii="Arial" w:hAnsi="Arial"/>
-          <w:sz w:val="28"/>
-          <w:szCs w:val="28"/>
-          <w:lang w:val="fr-FR"/>
-        </w:rPr>
-        <w:t xml:space="preserve">: </w:t>
-      </w:r>
-      <w:r>
-        <w:rPr>
-          <w:rFonts w:ascii="Arial" w:hAnsi="Arial"/>
-          <w:sz w:val="28"/>
-          <w:szCs w:val="28"/>
-          <w:lang w:val="fr-FR"/>
-        </w:rPr>
-        <w:t xml:space="preserve">agent d’accueil </w:t>
-      </w:r>
-      <w:r>
-        <w:rPr>
-          <w:rFonts w:ascii="Arial" w:hAnsi="Arial"/>
-          <w:sz w:val="28"/>
-          <w:szCs w:val="28"/>
-          <w:lang w:val="fr-FR"/>
-        </w:rPr>
-        <w:t xml:space="preserve">et d’orientation au service d’urgence </w:t>
-      </w:r>
-      <w:r>
-        <w:rPr>
-          <w:rFonts w:ascii="Arial" w:hAnsi="Arial"/>
-          <w:sz w:val="28"/>
-          <w:szCs w:val="28"/>
-          <w:lang w:val="fr-FR"/>
-        </w:rPr>
-        <w:t>au Centre</w:t>
-      </w:r>
-      <w:r>
-        <w:rPr>
-          <w:rFonts w:ascii="Arial" w:hAnsi="Arial"/>
-          <w:sz w:val="28"/>
-          <w:szCs w:val="28"/>
-          <w:lang w:val="fr-FR"/>
-        </w:rPr>
-        <w:t xml:space="preserve"> </w:t>
-      </w:r>
-      <w:r>
-        <w:rPr>
-          <w:rFonts w:ascii="Arial" w:hAnsi="Arial"/>
-          <w:sz w:val="28"/>
-          <w:szCs w:val="28"/>
-          <w:lang w:val="fr-FR"/>
-        </w:rPr>
-        <w:t>H</w:t>
-      </w:r>
-      <w:r>
-        <w:rPr>
-          <w:rFonts w:ascii="Arial" w:hAnsi="Arial"/>
-          <w:sz w:val="28"/>
-          <w:szCs w:val="28"/>
-          <w:lang w:val="fr-FR"/>
-        </w:rPr>
-        <w:t xml:space="preserve">ospitalier </w:t>
-      </w:r>
-      <w:r>
-        <w:rPr>
-          <w:rFonts w:ascii="Arial" w:hAnsi="Arial"/>
-          <w:sz w:val="28"/>
-          <w:szCs w:val="28"/>
-          <w:lang w:val="fr-FR"/>
-        </w:rPr>
-        <w:t xml:space="preserve">(fictif) </w:t>
-      </w:r>
-      <w:r>
-        <w:rPr>
-          <w:rFonts w:ascii="Arial" w:hAnsi="Arial"/>
-          <w:sz w:val="28"/>
-          <w:szCs w:val="28"/>
-          <w:lang w:val="fr-FR"/>
-        </w:rPr>
-        <w:t>SA</w:t>
-      </w:r>
-      <w:bookmarkEnd w:id="0"/>
-      <w:r>
-        <w:rPr>
-          <w:rFonts w:ascii="Arial" w:hAnsi="Arial"/>
-          <w:sz w:val="28"/>
-          <w:szCs w:val="28"/>
-          <w:lang w:val="fr-FR"/>
-        </w:rPr>
-        <w:t xml:space="preserve"> </w:t>
-      </w:r>
-    </w:p>
-    <w:p>
-      <w:pPr>
-        <w:jc w:val="both"/>
-        <w:rPr>
-          <w:lang w:val="fr-FR"/>
-        </w:rPr>
-      </w:pPr>
-      <w:r>
-        <w:rPr>
-          <w:rFonts w:ascii="Arial" w:hAnsi="Arial"/>
-          <w:lang w:val="fr-FR"/>
-        </w:rPr>
-        <w:t xml:space="preserve">Il s’agit de réduire l’affluence au service des urgences et d’accueil du centre hospitalier(fictif) Saint-Aurelien afin de mieux prendre en main les patients et faciliter leur orientation vers le service le plus indiqué. </w:t>
-      </w:r>
-    </w:p>
-    <w:p>
-      <w:pPr>
-        <w:pStyle w:val="Heading2"/>
-        <w:jc w:val="both"/>
-        <w:rPr>
+        <w:t>Executive summary</w:t>
+      </w:r>
+      <w:bookmarkEnd w:id="1"/>
+      <w:r>
+        <w:rPr>
+          <w:rFonts w:ascii="Arial" w:hAnsi="Arial"/>
           <w:sz w:val="28"/>
           <w:szCs w:val="28"/>
           <w:u w:val="single"/>
           <w:lang w:val="fr-FR"/>
         </w:rPr>
-      </w:pPr>
-      <w:bookmarkStart w:id="1" w:name="_Toc238269136"/>
-      <w:r>
-        <w:rPr>
-          <w:rFonts w:ascii="Arial" w:hAnsi="Arial"/>
+        <w:t xml:space="preserve"> </w:t>
+      </w:r>
+    </w:p>
+    <w:p>
+      <w:pPr>
+        <w:rPr>
+          <w:lang w:val="fr-FR"/>
+        </w:rPr>
+      </w:pPr>
+    </w:p>
+    <w:p>
+      <w:pPr>
+        <w:jc w:val="both"/>
+        <w:rPr>
+          <w:rFonts w:ascii="Menlo" w:hAnsi="Menlo" w:cs="Menlo"/>
+          <w:b/>
+          <w:bCs/>
+          <w:color w:val="759CFF"/>
+          <w:kern w:val="0"/>
+          <w:sz w:val="22"/>
+          <w:szCs w:val="22"/>
+          <w:lang w:val="fr-FR"/>
+        </w:rPr>
+      </w:pPr>
+      <w:r>
+        <w:rPr>
+          <w:rFonts w:ascii="Arial" w:hAnsi="Arial"/>
+          <w:lang w:val="fr-FR"/>
+        </w:rPr>
+        <w:t xml:space="preserve">Notre formation </w:t>
+      </w:r>
+      <w:r>
+        <w:rPr>
+          <w:rFonts w:ascii="Arial" w:hAnsi="Arial"/>
+          <w:lang w:val="fr-FR"/>
+        </w:rPr>
+        <w:t>AI Engineer</w:t>
+      </w:r>
+      <w:r>
+        <w:rPr>
+          <w:rFonts w:ascii="Arial" w:hAnsi="Arial"/>
+          <w:lang w:val="fr-FR"/>
+        </w:rPr>
+        <w:t xml:space="preserve"> </w:t>
+      </w:r>
+      <w:r>
+        <w:rPr>
+          <w:rFonts w:ascii="Arial" w:hAnsi="Arial"/>
+          <w:lang w:val="fr-FR"/>
+        </w:rPr>
+        <w:t xml:space="preserve">a été </w:t>
+      </w:r>
+      <w:r>
+        <w:rPr>
+          <w:rFonts w:ascii="Arial" w:hAnsi="Arial"/>
+          <w:lang w:val="fr-FR"/>
+        </w:rPr>
+        <w:t>focalisé</w:t>
+      </w:r>
+      <w:r>
+        <w:rPr>
+          <w:rFonts w:ascii="Arial" w:hAnsi="Arial"/>
+          <w:lang w:val="fr-FR"/>
+        </w:rPr>
+        <w:t>e</w:t>
+      </w:r>
+      <w:r>
+        <w:rPr>
+          <w:rFonts w:ascii="Arial" w:hAnsi="Arial"/>
+          <w:lang w:val="fr-FR"/>
+        </w:rPr>
+        <w:t xml:space="preserve"> sur la production, spécialisé dans l'industrialisation d'agents IA, </w:t>
+      </w:r>
+      <w:r>
+        <w:rPr>
+          <w:rFonts w:ascii="Arial" w:hAnsi="Arial"/>
+          <w:lang w:val="fr-FR"/>
+        </w:rPr>
+        <w:t>et l’</w:t>
+      </w:r>
+      <w:r>
+        <w:rPr>
+          <w:rFonts w:ascii="Arial" w:hAnsi="Arial"/>
+          <w:lang w:val="fr-FR"/>
+        </w:rPr>
+        <w:t>expert</w:t>
+      </w:r>
+      <w:r>
+        <w:rPr>
+          <w:rFonts w:ascii="Arial" w:hAnsi="Arial"/>
+          <w:lang w:val="fr-FR"/>
+        </w:rPr>
+        <w:t>ise</w:t>
+      </w:r>
+      <w:r>
+        <w:rPr>
+          <w:rFonts w:ascii="Arial" w:hAnsi="Arial"/>
+          <w:lang w:val="fr-FR"/>
+        </w:rPr>
+        <w:t xml:space="preserve"> </w:t>
+      </w:r>
+      <w:r>
+        <w:rPr>
+          <w:rFonts w:ascii="Arial" w:hAnsi="Arial"/>
+          <w:lang w:val="fr-FR"/>
+        </w:rPr>
+        <w:t>en architectures conteneurisées</w:t>
+      </w:r>
+      <w:r>
+        <w:rPr>
+          <w:rFonts w:ascii="Arial" w:hAnsi="Arial"/>
+          <w:lang w:val="fr-FR"/>
+        </w:rPr>
+        <w:t xml:space="preserve">. </w:t>
+      </w:r>
+      <w:r>
+        <w:rPr>
+          <w:rFonts w:ascii="Arial" w:hAnsi="Arial"/>
+          <w:lang w:val="fr-FR"/>
+        </w:rPr>
+        <w:t xml:space="preserve">Ce portfolio retrace les principales étapes franchies, les projets et les artéfacts résultants de cette formation.  </w:t>
+      </w:r>
+      <w:hyperlink r:id="rId8" w:history="1">
+        <w:r>
+          <w:rPr>
+            <w:rStyle w:val="Hyperlink"/>
+            <w:rFonts w:ascii="Menlo" w:hAnsi="Menlo" w:cs="Menlo"/>
+            <w:b/>
+            <w:bCs/>
+            <w:kern w:val="0"/>
+            <w:sz w:val="22"/>
+            <w:szCs w:val="22"/>
+            <w:lang w:val="fr-FR"/>
+          </w:rPr>
+          <w:t>https://AIEngOc2025.github.io/Portfolio/</w:t>
+        </w:r>
+      </w:hyperlink>
+      <w:r>
+        <w:rPr>
+          <w:rFonts w:ascii="Menlo" w:hAnsi="Menlo" w:cs="Menlo"/>
+          <w:b/>
+          <w:bCs/>
+          <w:color w:val="759CFF"/>
+          <w:kern w:val="0"/>
+          <w:sz w:val="22"/>
+          <w:szCs w:val="22"/>
+          <w:lang w:val="fr-FR"/>
+        </w:rPr>
+        <w:t xml:space="preserve">. </w:t>
+      </w:r>
+    </w:p>
+    <w:p>
+      <w:pPr>
+        <w:jc w:val="both"/>
+        <w:rPr>
+          <w:rFonts w:ascii="Menlo" w:hAnsi="Menlo" w:cs="Menlo"/>
+          <w:b/>
+          <w:bCs/>
+          <w:color w:val="759CFF"/>
+          <w:kern w:val="0"/>
+          <w:sz w:val="22"/>
+          <w:szCs w:val="22"/>
+          <w:lang w:val="fr-FR"/>
+        </w:rPr>
+      </w:pPr>
+    </w:p>
+    <w:p>
+      <w:pPr>
+        <w:jc w:val="both"/>
+        <w:rPr>
+          <w:rFonts w:ascii="Arial" w:hAnsi="Arial"/>
+          <w:lang w:val="fr-FR"/>
+        </w:rPr>
+      </w:pPr>
+      <w:r>
+        <w:rPr>
+          <w:rFonts w:ascii="Arial" w:hAnsi="Arial"/>
+          <w:lang w:val="fr-FR"/>
+        </w:rPr>
+        <w:t xml:space="preserve">Nous commencerons par le cas d’usage qui constitue l’agrégation de notre travail technique. </w:t>
+      </w:r>
+    </w:p>
+    <w:p>
+      <w:pPr>
+        <w:pStyle w:val="Heading1"/>
+        <w:jc w:val="both"/>
+        <w:rPr>
+          <w:rFonts w:ascii="Arial" w:hAnsi="Arial"/>
+          <w:sz w:val="28"/>
+          <w:szCs w:val="28"/>
+          <w:lang w:val="fr-FR"/>
+        </w:rPr>
+      </w:pPr>
+      <w:bookmarkStart w:id="2" w:name="_Toc238527934"/>
+      <w:r>
+        <w:rPr>
+          <w:rFonts w:ascii="Arial" w:hAnsi="Arial"/>
+          <w:sz w:val="28"/>
+          <w:szCs w:val="28"/>
+          <w:lang w:val="fr-FR"/>
+        </w:rPr>
+        <w:t xml:space="preserve">A </w:t>
+      </w:r>
+      <w:r>
+        <w:rPr>
+          <w:rFonts w:ascii="Arial" w:hAnsi="Arial"/>
+          <w:sz w:val="28"/>
+          <w:szCs w:val="28"/>
+          <w:lang w:val="fr-FR"/>
+        </w:rPr>
+        <w:t>–</w:t>
+      </w:r>
+      <w:r>
+        <w:rPr>
+          <w:rFonts w:ascii="Arial" w:hAnsi="Arial"/>
+          <w:sz w:val="28"/>
+          <w:szCs w:val="28"/>
+          <w:lang w:val="fr-FR"/>
+        </w:rPr>
+        <w:t xml:space="preserve"> </w:t>
+      </w:r>
+      <w:r>
+        <w:rPr>
+          <w:rFonts w:ascii="Arial" w:hAnsi="Arial"/>
+          <w:sz w:val="28"/>
+          <w:szCs w:val="28"/>
+          <w:lang w:val="fr-FR"/>
+        </w:rPr>
+        <w:t>cas d’usage</w:t>
+      </w:r>
+      <w:r>
+        <w:rPr>
+          <w:rFonts w:ascii="Arial" w:hAnsi="Arial"/>
+          <w:sz w:val="28"/>
+          <w:szCs w:val="28"/>
+          <w:lang w:val="fr-FR"/>
+        </w:rPr>
+        <w:t xml:space="preserve"> </w:t>
+      </w:r>
+      <w:r>
+        <w:rPr>
+          <w:rFonts w:ascii="Arial" w:hAnsi="Arial"/>
+          <w:sz w:val="28"/>
+          <w:szCs w:val="28"/>
+          <w:lang w:val="fr-FR"/>
+        </w:rPr>
+        <w:t>-</w:t>
+      </w:r>
+      <w:r>
+        <w:rPr>
+          <w:rFonts w:ascii="Arial" w:hAnsi="Arial"/>
+          <w:sz w:val="28"/>
+          <w:szCs w:val="28"/>
+          <w:lang w:val="fr-FR"/>
+        </w:rPr>
+        <w:t xml:space="preserve"> </w:t>
+      </w:r>
+      <w:r>
+        <w:rPr>
+          <w:rFonts w:ascii="Arial" w:hAnsi="Arial"/>
+          <w:sz w:val="28"/>
+          <w:szCs w:val="28"/>
+          <w:lang w:val="fr-FR"/>
+        </w:rPr>
+        <w:t>p</w:t>
+      </w:r>
+      <w:r>
+        <w:rPr>
+          <w:rFonts w:ascii="Arial" w:hAnsi="Arial"/>
+          <w:sz w:val="28"/>
+          <w:szCs w:val="28"/>
+          <w:lang w:val="fr-FR"/>
+        </w:rPr>
+        <w:t>rojet </w:t>
+      </w:r>
+      <w:r>
+        <w:rPr>
+          <w:rFonts w:ascii="Arial" w:hAnsi="Arial"/>
+          <w:sz w:val="28"/>
+          <w:szCs w:val="28"/>
+          <w:lang w:val="fr-FR"/>
+        </w:rPr>
+        <w:t xml:space="preserve">technique </w:t>
+      </w:r>
+      <w:r>
+        <w:rPr>
+          <w:rFonts w:ascii="Arial" w:hAnsi="Arial"/>
+          <w:sz w:val="28"/>
+          <w:szCs w:val="28"/>
+          <w:lang w:val="fr-FR"/>
+        </w:rPr>
+        <w:t xml:space="preserve">: </w:t>
+      </w:r>
+      <w:r>
+        <w:rPr>
+          <w:rFonts w:ascii="Arial" w:hAnsi="Arial"/>
+          <w:sz w:val="28"/>
+          <w:szCs w:val="28"/>
+          <w:lang w:val="fr-FR"/>
+        </w:rPr>
+        <w:t xml:space="preserve">agent d’accueil </w:t>
+      </w:r>
+      <w:r>
+        <w:rPr>
+          <w:rFonts w:ascii="Arial" w:hAnsi="Arial"/>
+          <w:sz w:val="28"/>
+          <w:szCs w:val="28"/>
+          <w:lang w:val="fr-FR"/>
+        </w:rPr>
+        <w:t xml:space="preserve">et d’orientation au service d’urgence </w:t>
+      </w:r>
+      <w:r>
+        <w:rPr>
+          <w:rFonts w:ascii="Arial" w:hAnsi="Arial"/>
+          <w:sz w:val="28"/>
+          <w:szCs w:val="28"/>
+          <w:lang w:val="fr-FR"/>
+        </w:rPr>
+        <w:t>au Centre</w:t>
+      </w:r>
+      <w:r>
+        <w:rPr>
+          <w:rFonts w:ascii="Arial" w:hAnsi="Arial"/>
+          <w:sz w:val="28"/>
+          <w:szCs w:val="28"/>
+          <w:lang w:val="fr-FR"/>
+        </w:rPr>
+        <w:t xml:space="preserve"> </w:t>
+      </w:r>
+      <w:r>
+        <w:rPr>
+          <w:rFonts w:ascii="Arial" w:hAnsi="Arial"/>
+          <w:sz w:val="28"/>
+          <w:szCs w:val="28"/>
+          <w:lang w:val="fr-FR"/>
+        </w:rPr>
+        <w:t>H</w:t>
+      </w:r>
+      <w:r>
+        <w:rPr>
+          <w:rFonts w:ascii="Arial" w:hAnsi="Arial"/>
+          <w:sz w:val="28"/>
+          <w:szCs w:val="28"/>
+          <w:lang w:val="fr-FR"/>
+        </w:rPr>
+        <w:t xml:space="preserve">ospitalier </w:t>
+      </w:r>
+      <w:r>
+        <w:rPr>
+          <w:rFonts w:ascii="Arial" w:hAnsi="Arial"/>
+          <w:sz w:val="28"/>
+          <w:szCs w:val="28"/>
+          <w:lang w:val="fr-FR"/>
+        </w:rPr>
+        <w:t xml:space="preserve">(fictif) </w:t>
+      </w:r>
+      <w:r>
+        <w:rPr>
+          <w:rFonts w:ascii="Arial" w:hAnsi="Arial"/>
+          <w:sz w:val="28"/>
+          <w:szCs w:val="28"/>
+          <w:lang w:val="fr-FR"/>
+        </w:rPr>
+        <w:t>SA</w:t>
+      </w:r>
+      <w:bookmarkEnd w:id="2"/>
+      <w:r>
+        <w:rPr>
+          <w:rFonts w:ascii="Arial" w:hAnsi="Arial"/>
+          <w:sz w:val="28"/>
+          <w:szCs w:val="28"/>
+          <w:lang w:val="fr-FR"/>
+        </w:rPr>
+        <w:t xml:space="preserve"> </w:t>
+      </w:r>
+    </w:p>
+    <w:p>
+      <w:pPr>
+        <w:rPr>
+          <w:lang w:val="fr-FR"/>
+        </w:rPr>
+      </w:pPr>
+    </w:p>
+    <w:p>
+      <w:pPr>
+        <w:jc w:val="both"/>
+        <w:rPr>
+          <w:rFonts w:ascii="Arial" w:hAnsi="Arial"/>
+          <w:lang w:val="fr-FR"/>
+        </w:rPr>
+      </w:pPr>
+      <w:r>
+        <w:rPr>
+          <w:rFonts w:ascii="Arial" w:hAnsi="Arial"/>
+          <w:lang w:val="fr-FR"/>
+        </w:rPr>
+        <w:t xml:space="preserve">Le centre hospitalier Saint-Aurelien (CHSA) est sujet à une affluence débordante de patient au service d’accueil et d’orientation des urgences. Notre mission consiste à proposer et construire une solution technique à ce problème au CHSA </w:t>
+      </w:r>
+      <w:r>
+        <w:rPr>
+          <w:rFonts w:ascii="Arial" w:hAnsi="Arial"/>
+          <w:lang w:val="fr-FR"/>
+        </w:rPr>
+        <w:t xml:space="preserve">afin de mieux prendre en main les patients et faciliter leur orientation vers le service </w:t>
+      </w:r>
+      <w:r>
+        <w:rPr>
+          <w:rFonts w:ascii="Arial" w:hAnsi="Arial"/>
+          <w:lang w:val="fr-FR"/>
+        </w:rPr>
+        <w:t>des urgences l</w:t>
+      </w:r>
+      <w:r>
+        <w:rPr>
+          <w:rFonts w:ascii="Arial" w:hAnsi="Arial"/>
+          <w:lang w:val="fr-FR"/>
+        </w:rPr>
+        <w:t xml:space="preserve">e plus indiqué. </w:t>
+      </w:r>
+    </w:p>
+    <w:p>
+      <w:pPr>
+        <w:jc w:val="both"/>
+        <w:rPr>
+          <w:rFonts w:ascii="Arial" w:hAnsi="Arial"/>
+          <w:lang w:val="fr-FR"/>
+        </w:rPr>
+      </w:pPr>
+    </w:p>
+    <w:p>
+      <w:pPr>
+        <w:jc w:val="both"/>
+        <w:rPr>
+          <w:rFonts w:ascii="Arial" w:hAnsi="Arial"/>
+          <w:lang w:val="fr-FR"/>
+        </w:rPr>
+      </w:pPr>
+      <w:r>
+        <w:rPr>
+          <w:rFonts w:ascii="Arial" w:hAnsi="Arial"/>
+          <w:lang w:val="fr-FR"/>
+        </w:rPr>
+        <w:t>Dans le cadre de ce projet, nous avons proposé une amélioration de notre POC «Finetunez votre LLM »</w:t>
+      </w:r>
+    </w:p>
+    <w:p>
+      <w:pPr>
+        <w:pStyle w:val="Heading2"/>
+        <w:jc w:val="both"/>
+        <w:rPr>
           <w:sz w:val="28"/>
           <w:szCs w:val="28"/>
           <w:u w:val="single"/>
           <w:lang w:val="fr-FR"/>
         </w:rPr>
-        <w:t xml:space="preserve">Actions menées </w:t>
-      </w:r>
+      </w:pPr>
+      <w:bookmarkStart w:id="3" w:name="_Toc238527935"/>
       <w:r>
         <w:rPr>
           <w:rFonts w:ascii="Arial" w:hAnsi="Arial"/>
@@ -2446,9 +2726,19 @@
           <w:u w:val="single"/>
           <w:lang w:val="fr-FR"/>
         </w:rPr>
+        <w:t xml:space="preserve">Actions menées </w:t>
+      </w:r>
+      <w:r>
+        <w:rPr>
+          <w:rFonts w:ascii="Arial" w:hAnsi="Arial"/>
+          <w:sz w:val="28"/>
+          <w:szCs w:val="28"/>
+          <w:u w:val="single"/>
+          <w:lang w:val="fr-FR"/>
+        </w:rPr>
         <w:t>au cours du projet</w:t>
       </w:r>
-      <w:bookmarkEnd w:id="1"/>
+      <w:bookmarkEnd w:id="3"/>
       <w:r>
         <w:rPr>
           <w:rFonts w:ascii="Arial" w:hAnsi="Arial"/>
@@ -2507,6 +2797,7 @@
         <w:pStyle w:val="ListParagraph"/>
         <w:jc w:val="both"/>
         <w:rPr>
+          <w:rFonts w:ascii="Arial" w:hAnsi="Arial"/>
           <w:sz w:val="22"/>
           <w:szCs w:val="22"/>
           <w:lang w:val="fr-FR"/>
@@ -2521,25 +2812,35 @@
         </w:rPr>
         <w:t>- contexte hospitalier</w:t>
       </w:r>
+      <w:r>
+        <w:rPr>
+          <w:rFonts w:ascii="Arial" w:hAnsi="Arial"/>
+          <w:sz w:val="22"/>
+          <w:szCs w:val="22"/>
+          <w:lang w:val="fr-FR"/>
+        </w:rPr>
+        <w:t> : service d’urgence</w:t>
+      </w:r>
     </w:p>
     <w:p>
       <w:pPr>
         <w:pStyle w:val="ListParagraph"/>
         <w:jc w:val="both"/>
         <w:rPr>
-          <w:sz w:val="22"/>
-          <w:szCs w:val="22"/>
-          <w:lang w:val="fr-FR"/>
-        </w:rPr>
-      </w:pPr>
-      <w:r>
-        <w:rPr>
-          <w:rFonts w:ascii="Arial" w:hAnsi="Arial"/>
-          <w:sz w:val="22"/>
-          <w:szCs w:val="22"/>
-          <w:lang w:val="fr-FR"/>
-        </w:rPr>
-        <w:t>- résorber la surcharge aux services d’urgence</w:t>
+          <w:rFonts w:ascii="Arial" w:hAnsi="Arial"/>
+          <w:sz w:val="22"/>
+          <w:szCs w:val="22"/>
+          <w:lang w:val="fr-FR"/>
+        </w:rPr>
+      </w:pPr>
+      <w:r>
+        <w:rPr>
+          <w:rFonts w:ascii="Arial" w:hAnsi="Arial"/>
+          <w:sz w:val="22"/>
+          <w:szCs w:val="22"/>
+          <w:lang w:val="fr-FR"/>
+        </w:rPr>
+        <w:t>- contexte social : milieu cosmopolite (PIID à ne pas divulguer)</w:t>
       </w:r>
     </w:p>
     <w:p>
@@ -2559,16 +2860,25 @@
           <w:szCs w:val="22"/>
           <w:lang w:val="fr-FR"/>
         </w:rPr>
-        <w:t>- orientation rapide et précise des patients au services d’accueil et d’orientation</w:t>
-      </w:r>
-      <w:r>
-        <w:rPr>
-          <w:rFonts w:ascii="Arial" w:hAnsi="Arial"/>
-          <w:sz w:val="22"/>
-          <w:szCs w:val="22"/>
-          <w:lang w:val="fr-FR"/>
-        </w:rPr>
-        <w:t xml:space="preserve"> des services d’urgence</w:t>
+        <w:t xml:space="preserve">- </w:t>
+      </w:r>
+      <w:r>
+        <w:rPr>
+          <w:rFonts w:ascii="Arial" w:hAnsi="Arial"/>
+          <w:sz w:val="22"/>
+          <w:szCs w:val="22"/>
+          <w:lang w:val="fr-FR"/>
+        </w:rPr>
+        <w:t xml:space="preserve">proposer une solution pour </w:t>
+      </w:r>
+      <w:r>
+        <w:rPr>
+          <w:rFonts w:ascii="Arial" w:hAnsi="Arial"/>
+          <w:sz w:val="22"/>
+          <w:szCs w:val="22"/>
+          <w:lang w:val="fr-FR"/>
+        </w:rPr>
+        <w:t>résorber la surcharge aux services d’urgence</w:t>
       </w:r>
       <w:r>
         <w:rPr>
@@ -3072,7 +3382,7 @@
           <w:lang w:val="fr-FR"/>
         </w:rPr>
       </w:pPr>
-      <w:commentRangeStart w:id="2"/>
+      <w:commentRangeStart w:id="4"/>
       <w:r>
         <w:rPr>
           <w:rFonts w:ascii="Arial" w:hAnsi="Arial"/>
@@ -3091,7 +3401,7 @@
         </w:rPr>
         <w:t xml:space="preserve">effectuer un cadrage du projet. </w:t>
       </w:r>
-      <w:commentRangeEnd w:id="2"/>
+      <w:commentRangeEnd w:id="4"/>
       <w:r>
         <w:rPr>
           <w:rStyle w:val="CommentReference"/>
@@ -3099,7 +3409,7 @@
           <w:szCs w:val="22"/>
           <w:lang w:val="fr-FR"/>
         </w:rPr>
-        <w:commentReference w:id="2"/>
+        <w:commentReference w:id="4"/>
       </w:r>
     </w:p>
     <w:p>
@@ -3668,7 +3978,7 @@
                 <w:szCs w:val="18"/>
                 <w:lang w:val="fr-FR"/>
               </w:rPr>
-              <w:t xml:space="preserve">- </w:t>
+              <w:t>-</w:t>
             </w:r>
             <w:r>
               <w:rPr>
@@ -4078,16 +4388,519 @@
       <w:pPr>
         <w:jc w:val="both"/>
         <w:rPr>
-          <w:sz w:val="22"/>
-          <w:szCs w:val="22"/>
-          <w:lang w:val="fr-FR"/>
-        </w:rPr>
-      </w:pPr>
-      <w:r>
-        <w:rPr>
-          <w:rFonts w:ascii="Arial" w:hAnsi="Arial"/>
-          <w:sz w:val="22"/>
-          <w:szCs w:val="22"/>
+          <w:rFonts w:ascii="Arial" w:hAnsi="Arial"/>
+          <w:sz w:val="22"/>
+          <w:szCs w:val="22"/>
+          <w:u w:val="single"/>
+          <w:lang w:val="fr-FR"/>
+        </w:rPr>
+      </w:pPr>
+      <w:r>
+        <w:rPr>
+          <w:rFonts w:ascii="Arial" w:hAnsi="Arial"/>
+          <w:sz w:val="22"/>
+          <w:szCs w:val="22"/>
+          <w:u w:val="single"/>
+          <w:lang w:val="fr-FR"/>
+        </w:rPr>
+        <w:t>Le POC</w:t>
+      </w:r>
+    </w:p>
+    <w:p>
+      <w:pPr>
+        <w:jc w:val="both"/>
+        <w:rPr>
+          <w:rFonts w:ascii="Arial" w:hAnsi="Arial"/>
+          <w:sz w:val="22"/>
+          <w:szCs w:val="22"/>
+          <w:lang w:val="fr-FR"/>
+        </w:rPr>
+      </w:pPr>
+    </w:p>
+    <w:p>
+      <w:pPr>
+        <w:jc w:val="both"/>
+        <w:rPr>
+          <w:rFonts w:ascii="Arial" w:hAnsi="Arial"/>
+          <w:sz w:val="22"/>
+          <w:szCs w:val="22"/>
+          <w:lang w:val="fr-FR"/>
+        </w:rPr>
+      </w:pPr>
+      <w:r>
+        <w:rPr>
+          <w:rFonts w:ascii="Arial" w:hAnsi="Arial"/>
+          <w:sz w:val="22"/>
+          <w:szCs w:val="22"/>
+          <w:lang w:val="fr-FR"/>
+        </w:rPr>
+        <w:t>Données : 5000 entrées bilingues anonymisées</w:t>
+      </w:r>
+      <w:r>
+        <w:rPr>
+          <w:rFonts w:ascii="Arial" w:hAnsi="Arial"/>
+          <w:sz w:val="22"/>
+          <w:szCs w:val="22"/>
+          <w:lang w:val="fr-FR"/>
+        </w:rPr>
+        <w:t xml:space="preserve">. </w:t>
+      </w:r>
+    </w:p>
+    <w:p>
+      <w:pPr>
+        <w:jc w:val="both"/>
+        <w:rPr>
+          <w:rFonts w:ascii="Arial" w:hAnsi="Arial"/>
+          <w:sz w:val="22"/>
+          <w:szCs w:val="22"/>
+          <w:lang w:val="fr-FR"/>
+        </w:rPr>
+      </w:pPr>
+    </w:p>
+    <w:p>
+      <w:pPr>
+        <w:jc w:val="both"/>
+        <w:rPr>
+          <w:rFonts w:ascii="Arial" w:hAnsi="Arial"/>
+          <w:sz w:val="22"/>
+          <w:szCs w:val="22"/>
+          <w:u w:val="single"/>
+          <w:lang w:val="fr-FR"/>
+        </w:rPr>
+      </w:pPr>
+      <w:r>
+        <w:rPr>
+          <w:rFonts w:ascii="Arial" w:hAnsi="Arial"/>
+          <w:sz w:val="22"/>
+          <w:szCs w:val="22"/>
+          <w:u w:val="single"/>
+          <w:lang w:val="fr-FR"/>
+        </w:rPr>
+        <w:t xml:space="preserve">Méthode : </w:t>
+      </w:r>
+    </w:p>
+    <w:p>
+      <w:pPr>
+        <w:pStyle w:val="ListParagraph"/>
+        <w:numPr>
+          <w:ilvl w:val="0"/>
+          <w:numId w:val="8"/>
+        </w:numPr>
+        <w:jc w:val="both"/>
+        <w:rPr>
+          <w:rFonts w:ascii="Arial" w:hAnsi="Arial"/>
+          <w:sz w:val="22"/>
+          <w:szCs w:val="22"/>
+          <w:lang w:val="en-GB"/>
+        </w:rPr>
+      </w:pPr>
+      <w:r>
+        <w:rPr>
+          <w:rFonts w:ascii="Arial" w:hAnsi="Arial"/>
+          <w:sz w:val="22"/>
+          <w:szCs w:val="22"/>
+          <w:lang w:val="en-GB"/>
+        </w:rPr>
+        <w:t xml:space="preserve">Supervised Finetuning + LoRA </w:t>
+      </w:r>
+    </w:p>
+    <w:p>
+      <w:pPr>
+        <w:pStyle w:val="ListParagraph"/>
+        <w:numPr>
+          <w:ilvl w:val="0"/>
+          <w:numId w:val="8"/>
+        </w:numPr>
+        <w:jc w:val="both"/>
+        <w:rPr>
+          <w:rFonts w:ascii="Arial" w:hAnsi="Arial"/>
+          <w:sz w:val="22"/>
+          <w:szCs w:val="22"/>
+          <w:lang w:val="en-GB"/>
+        </w:rPr>
+      </w:pPr>
+      <w:r>
+        <w:rPr>
+          <w:rFonts w:ascii="Arial" w:hAnsi="Arial"/>
+          <w:sz w:val="22"/>
+          <w:szCs w:val="22"/>
+          <w:lang w:val="en-GB"/>
+        </w:rPr>
+        <w:t>Direct preference optimization</w:t>
+      </w:r>
+      <w:r>
+        <w:rPr>
+          <w:rFonts w:ascii="Arial" w:hAnsi="Arial"/>
+          <w:sz w:val="22"/>
+          <w:szCs w:val="22"/>
+          <w:lang w:val="en-GB"/>
+        </w:rPr>
+        <w:t xml:space="preserve"> </w:t>
+      </w:r>
+      <w:r>
+        <w:rPr>
+          <w:rFonts w:ascii="Arial" w:hAnsi="Arial"/>
+          <w:sz w:val="22"/>
+          <w:szCs w:val="22"/>
+          <w:lang w:val="en-GB"/>
+        </w:rPr>
+        <w:t xml:space="preserve">(DPO) </w:t>
+      </w:r>
+    </w:p>
+    <w:p>
+      <w:pPr>
+        <w:pStyle w:val="ListParagraph"/>
+        <w:jc w:val="both"/>
+        <w:rPr>
+          <w:rFonts w:ascii="Arial" w:hAnsi="Arial"/>
+          <w:sz w:val="22"/>
+          <w:szCs w:val="22"/>
+          <w:lang w:val="en-GB"/>
+        </w:rPr>
+      </w:pPr>
+    </w:p>
+    <w:p>
+      <w:pPr>
+        <w:jc w:val="both"/>
+        <w:rPr>
+          <w:rFonts w:ascii="Arial" w:hAnsi="Arial"/>
+          <w:sz w:val="22"/>
+          <w:szCs w:val="22"/>
+          <w:u w:val="single"/>
+          <w:lang w:val="en-GB"/>
+        </w:rPr>
+      </w:pPr>
+      <w:r>
+        <w:rPr>
+          <w:rFonts w:ascii="Arial" w:hAnsi="Arial"/>
+          <w:sz w:val="22"/>
+          <w:szCs w:val="22"/>
+          <w:u w:val="single"/>
+          <w:lang w:val="en-GB"/>
+        </w:rPr>
+        <w:t>Outils:</w:t>
+      </w:r>
+    </w:p>
+    <w:p>
+      <w:pPr>
+        <w:pStyle w:val="ListParagraph"/>
+        <w:numPr>
+          <w:ilvl w:val="0"/>
+          <w:numId w:val="9"/>
+        </w:numPr>
+        <w:jc w:val="both"/>
+        <w:rPr>
+          <w:rFonts w:ascii="Arial" w:hAnsi="Arial"/>
+          <w:sz w:val="22"/>
+          <w:szCs w:val="22"/>
+          <w:lang w:val="en-GB"/>
+        </w:rPr>
+      </w:pPr>
+      <w:r>
+        <w:rPr>
+          <w:rFonts w:ascii="Arial" w:hAnsi="Arial"/>
+          <w:sz w:val="22"/>
+          <w:szCs w:val="22"/>
+          <w:lang w:val="en-GB"/>
+        </w:rPr>
+        <w:t>Scripts python</w:t>
+      </w:r>
+    </w:p>
+    <w:p>
+      <w:pPr>
+        <w:pStyle w:val="ListParagraph"/>
+        <w:numPr>
+          <w:ilvl w:val="0"/>
+          <w:numId w:val="9"/>
+        </w:numPr>
+        <w:jc w:val="both"/>
+        <w:rPr>
+          <w:rFonts w:ascii="Arial" w:hAnsi="Arial"/>
+          <w:sz w:val="22"/>
+          <w:szCs w:val="22"/>
+          <w:lang w:val="en-GB"/>
+        </w:rPr>
+      </w:pPr>
+      <w:r>
+        <w:rPr>
+          <w:rFonts w:ascii="Arial" w:hAnsi="Arial"/>
+          <w:sz w:val="22"/>
+          <w:szCs w:val="22"/>
+          <w:lang w:val="en-GB"/>
+        </w:rPr>
+        <w:t>Conteneur docker</w:t>
+      </w:r>
+    </w:p>
+    <w:p>
+      <w:pPr>
+        <w:pStyle w:val="ListParagraph"/>
+        <w:numPr>
+          <w:ilvl w:val="0"/>
+          <w:numId w:val="9"/>
+        </w:numPr>
+        <w:jc w:val="both"/>
+        <w:rPr>
+          <w:rFonts w:ascii="Arial" w:hAnsi="Arial"/>
+          <w:sz w:val="22"/>
+          <w:szCs w:val="22"/>
+          <w:lang w:val="en-GB"/>
+        </w:rPr>
+      </w:pPr>
+      <w:r>
+        <w:rPr>
+          <w:rFonts w:ascii="Arial" w:hAnsi="Arial"/>
+          <w:sz w:val="22"/>
+          <w:szCs w:val="22"/>
+          <w:lang w:val="en-GB"/>
+        </w:rPr>
+        <w:t>Github actions</w:t>
+      </w:r>
+    </w:p>
+    <w:p>
+      <w:pPr>
+        <w:pStyle w:val="ListParagraph"/>
+        <w:numPr>
+          <w:ilvl w:val="0"/>
+          <w:numId w:val="9"/>
+        </w:numPr>
+        <w:jc w:val="both"/>
+        <w:rPr>
+          <w:rFonts w:ascii="Arial" w:hAnsi="Arial"/>
+          <w:sz w:val="22"/>
+          <w:szCs w:val="22"/>
+          <w:lang w:val="en-GB"/>
+        </w:rPr>
+      </w:pPr>
+      <w:r>
+        <w:rPr>
+          <w:rFonts w:ascii="Arial" w:hAnsi="Arial"/>
+          <w:sz w:val="22"/>
+          <w:szCs w:val="22"/>
+          <w:lang w:val="en-GB"/>
+        </w:rPr>
+        <w:t>GPU (2xNvidia T4)</w:t>
+      </w:r>
+    </w:p>
+    <w:p>
+      <w:pPr>
+        <w:jc w:val="both"/>
+        <w:rPr>
+          <w:rFonts w:ascii="Arial" w:hAnsi="Arial"/>
+          <w:sz w:val="22"/>
+          <w:szCs w:val="22"/>
+          <w:lang w:val="en-GB"/>
+        </w:rPr>
+      </w:pPr>
+    </w:p>
+    <w:p>
+      <w:pPr>
+        <w:jc w:val="both"/>
+        <w:rPr>
+          <w:rFonts w:ascii="Arial" w:hAnsi="Arial"/>
+          <w:sz w:val="22"/>
+          <w:szCs w:val="22"/>
+          <w:u w:val="single"/>
+          <w:lang w:val="fr-FR"/>
+        </w:rPr>
+      </w:pPr>
+      <w:r>
+        <w:rPr>
+          <w:rFonts w:ascii="Arial" w:hAnsi="Arial"/>
+          <w:sz w:val="22"/>
+          <w:szCs w:val="22"/>
+          <w:u w:val="single"/>
+          <w:lang w:val="fr-FR"/>
+        </w:rPr>
+        <w:t>Architecture :</w:t>
+      </w:r>
+      <w:r>
+        <w:rPr>
+          <w:rFonts w:ascii="Arial" w:hAnsi="Arial"/>
+          <w:sz w:val="22"/>
+          <w:szCs w:val="22"/>
+          <w:lang w:val="fr-FR"/>
+        </w:rPr>
+        <w:t xml:space="preserve"> M</w:t>
+      </w:r>
+      <w:r>
+        <w:rPr>
+          <w:rFonts w:ascii="Arial" w:hAnsi="Arial"/>
+          <w:sz w:val="22"/>
+          <w:szCs w:val="22"/>
+          <w:lang w:val="fr-FR"/>
+        </w:rPr>
+        <w:t xml:space="preserve">icro services  </w:t>
+      </w:r>
+    </w:p>
+    <w:p>
+      <w:pPr>
+        <w:pStyle w:val="ListParagraph"/>
+        <w:numPr>
+          <w:ilvl w:val="0"/>
+          <w:numId w:val="2"/>
+        </w:numPr>
+        <w:jc w:val="both"/>
+        <w:rPr>
+          <w:rFonts w:ascii="Arial" w:hAnsi="Arial"/>
+          <w:sz w:val="22"/>
+          <w:szCs w:val="22"/>
+          <w:lang w:val="fr-FR"/>
+        </w:rPr>
+      </w:pPr>
+      <w:r>
+        <w:rPr>
+          <w:rFonts w:ascii="Arial" w:hAnsi="Arial"/>
+          <w:sz w:val="22"/>
+          <w:szCs w:val="22"/>
+          <w:lang w:val="fr-FR"/>
+        </w:rPr>
+        <w:t xml:space="preserve">3 conteneurs </w:t>
+      </w:r>
+    </w:p>
+    <w:p>
+      <w:pPr>
+        <w:pStyle w:val="ListParagraph"/>
+        <w:numPr>
+          <w:ilvl w:val="0"/>
+          <w:numId w:val="2"/>
+        </w:numPr>
+        <w:jc w:val="both"/>
+        <w:rPr>
+          <w:rFonts w:ascii="Arial" w:hAnsi="Arial"/>
+          <w:sz w:val="22"/>
+          <w:szCs w:val="22"/>
+          <w:lang w:val="en-GB"/>
+        </w:rPr>
+      </w:pPr>
+      <w:r>
+        <w:rPr>
+          <w:rFonts w:ascii="Arial" w:hAnsi="Arial"/>
+          <w:sz w:val="22"/>
+          <w:szCs w:val="22"/>
+          <w:lang w:val="en-GB"/>
+        </w:rPr>
+        <w:t xml:space="preserve">bucket Google Cloud Storage (GCS) </w:t>
+      </w:r>
+    </w:p>
+    <w:p>
+      <w:pPr>
+        <w:jc w:val="both"/>
+        <w:rPr>
+          <w:rFonts w:ascii="Arial" w:hAnsi="Arial"/>
+          <w:sz w:val="22"/>
+          <w:szCs w:val="22"/>
+          <w:lang w:val="en-GB"/>
+        </w:rPr>
+      </w:pPr>
+    </w:p>
+    <w:p>
+      <w:pPr>
+        <w:jc w:val="both"/>
+        <w:rPr>
+          <w:rFonts w:ascii="Arial" w:hAnsi="Arial"/>
+          <w:sz w:val="22"/>
+          <w:szCs w:val="22"/>
+          <w:lang w:val="fr-FR"/>
+        </w:rPr>
+      </w:pPr>
+      <w:r>
+        <w:rPr>
+          <w:rFonts w:ascii="Arial" w:hAnsi="Arial"/>
+          <w:sz w:val="22"/>
+          <w:szCs w:val="22"/>
+          <w:u w:val="single"/>
+          <w:lang w:val="fr-FR"/>
+        </w:rPr>
+        <w:t>Résultats</w:t>
+      </w:r>
+      <w:r>
+        <w:rPr>
+          <w:rFonts w:ascii="Arial" w:hAnsi="Arial"/>
+          <w:sz w:val="22"/>
+          <w:szCs w:val="22"/>
+          <w:lang w:val="fr-FR"/>
+        </w:rPr>
+        <w:t> :</w:t>
+      </w:r>
+    </w:p>
+    <w:p>
+      <w:pPr>
+        <w:jc w:val="both"/>
+        <w:rPr>
+          <w:rFonts w:ascii="Arial" w:hAnsi="Arial"/>
+          <w:sz w:val="22"/>
+          <w:szCs w:val="22"/>
+          <w:lang w:val="fr-FR"/>
+        </w:rPr>
+      </w:pPr>
+      <w:r>
+        <w:rPr>
+          <w:rFonts w:ascii="Arial" w:hAnsi="Arial"/>
+          <w:sz w:val="22"/>
+          <w:szCs w:val="22"/>
+          <w:lang w:val="fr-FR"/>
+        </w:rPr>
+        <w:t>% de triage &lt; 10%</w:t>
+      </w:r>
+    </w:p>
+    <w:p>
+      <w:pPr>
+        <w:jc w:val="both"/>
+        <w:rPr>
+          <w:rFonts w:ascii="Arial" w:hAnsi="Arial"/>
+          <w:sz w:val="22"/>
+          <w:szCs w:val="22"/>
+          <w:lang w:val="fr-FR"/>
+        </w:rPr>
+      </w:pPr>
+      <w:r>
+        <w:rPr>
+          <w:rFonts w:ascii="Arial" w:hAnsi="Arial"/>
+          <w:sz w:val="22"/>
+          <w:szCs w:val="22"/>
+          <w:lang w:val="fr-FR"/>
+        </w:rPr>
+        <w:t>Infra fonctionnelle, mais triage à améliorer</w:t>
+      </w:r>
+    </w:p>
+    <w:p>
+      <w:pPr>
+        <w:jc w:val="both"/>
+        <w:rPr>
+          <w:rFonts w:ascii="Arial" w:hAnsi="Arial"/>
+          <w:sz w:val="22"/>
+          <w:szCs w:val="22"/>
+          <w:lang w:val="fr-FR"/>
+        </w:rPr>
+      </w:pPr>
+    </w:p>
+    <w:p>
+      <w:pPr>
+        <w:jc w:val="both"/>
+        <w:rPr>
+          <w:rFonts w:ascii="Arial" w:hAnsi="Arial"/>
+          <w:sz w:val="22"/>
+          <w:szCs w:val="22"/>
+          <w:lang w:val="fr-FR"/>
+        </w:rPr>
+      </w:pPr>
+    </w:p>
+    <w:p>
+      <w:pPr>
+        <w:jc w:val="both"/>
+        <w:rPr>
+          <w:sz w:val="22"/>
+          <w:szCs w:val="22"/>
+          <w:u w:val="single"/>
+          <w:lang w:val="fr-FR"/>
+        </w:rPr>
+      </w:pPr>
+      <w:r>
+        <w:rPr>
+          <w:rFonts w:ascii="Arial" w:hAnsi="Arial"/>
+          <w:sz w:val="22"/>
+          <w:szCs w:val="22"/>
+          <w:u w:val="single"/>
           <w:lang w:val="fr-FR"/>
         </w:rPr>
         <w:t>Analyse de transition</w:t>
@@ -4135,6 +4948,7 @@
           <w:szCs w:val="22"/>
           <w:lang w:val="fr-FR"/>
         </w:rPr>
+        <w:lastRenderedPageBreak/>
         <w:t>Du POC au MVP</w:t>
       </w:r>
     </w:p>
@@ -4288,7 +5102,7 @@
           <w:szCs w:val="22"/>
           <w:lang w:val="fr-FR"/>
         </w:rPr>
-        <w:t xml:space="preserve">     dérive (drift) des performances du modèle en conditions réelles.</w:t>
+        <w:t xml:space="preserve">     dérive(drift) des performances du modèle en conditions réelles.</w:t>
       </w:r>
     </w:p>
     <w:p>
@@ -4518,7 +5332,7 @@
           <w:lang w:val="fr-FR"/>
         </w:rPr>
       </w:pPr>
-      <w:bookmarkStart w:id="3" w:name="_Toc238269137"/>
+      <w:bookmarkStart w:id="5" w:name="_Toc238527936"/>
       <w:r>
         <w:rPr>
           <w:rFonts w:ascii="Arial" w:hAnsi="Arial"/>
@@ -4559,7 +5373,7 @@
         </w:rPr>
         <w:t>dditionnels</w:t>
       </w:r>
-      <w:bookmarkEnd w:id="3"/>
+      <w:bookmarkEnd w:id="5"/>
     </w:p>
     <w:p>
       <w:pPr>
@@ -4598,7 +5412,7 @@
           <w:lang w:eastAsia="en-GB"/>
         </w:rPr>
       </w:pPr>
-      <w:bookmarkStart w:id="4" w:name="_Toc238269138"/>
+      <w:bookmarkStart w:id="6" w:name="_Toc238527937"/>
       <w:r>
         <w:rPr>
           <w:rFonts w:ascii="Arial" w:eastAsia="Times New Roman" w:hAnsi="Arial"/>
@@ -4646,7 +5460,7 @@
         </w:rPr>
         <w:t xml:space="preserve"> acquises et developpées</w:t>
       </w:r>
-      <w:bookmarkEnd w:id="4"/>
+      <w:bookmarkEnd w:id="6"/>
     </w:p>
     <w:p>
       <w:pPr>
@@ -5699,7 +6513,9 @@
           <w:lang w:eastAsia="en-GB"/>
         </w:rPr>
       </w:pPr>
-      <w:bookmarkStart w:id="5" w:name="_Toc238269139"/>
+      <w:bookmarkStart w:id="7" w:name="_2_–_Projets"/>
+      <w:bookmarkStart w:id="8" w:name="_Toc238527938"/>
+      <w:bookmarkEnd w:id="7"/>
       <w:r>
         <w:rPr>
           <w:rFonts w:ascii="Arial" w:eastAsia="Times New Roman" w:hAnsi="Arial"/>
@@ -5718,7 +6534,7 @@
         </w:rPr>
         <w:t>réalisés</w:t>
       </w:r>
-      <w:bookmarkEnd w:id="5"/>
+      <w:bookmarkEnd w:id="8"/>
     </w:p>
     <w:p>
       <w:pPr>
@@ -5800,7 +6616,31 @@
           <w14:ligatures w14:val="none"/>
         </w:rPr>
         <w:lastRenderedPageBreak/>
-        <w:t xml:space="preserve">-  Projet technique : Finetuner un LLM. </w:t>
+        <w:t>-  Projet technique : Finetune</w:t>
+      </w:r>
+      <w:r>
+        <w:rPr>
+          <w:rFonts w:ascii="Arial" w:eastAsia="Times New Roman" w:hAnsi="Arial" w:cs="Arial"/>
+          <w:color w:val="271A38"/>
+          <w:kern w:val="0"/>
+          <w:sz w:val="22"/>
+          <w:szCs w:val="22"/>
+          <w:lang w:eastAsia="en-GB"/>
+          <w14:ligatures w14:val="none"/>
+        </w:rPr>
+        <w:t>z votre</w:t>
+      </w:r>
+      <w:r>
+        <w:rPr>
+          <w:rFonts w:ascii="Arial" w:eastAsia="Times New Roman" w:hAnsi="Arial" w:cs="Arial"/>
+          <w:color w:val="271A38"/>
+          <w:kern w:val="0"/>
+          <w:sz w:val="22"/>
+          <w:szCs w:val="22"/>
+          <w:lang w:eastAsia="en-GB"/>
+          <w14:ligatures w14:val="none"/>
+        </w:rPr>
+        <w:t xml:space="preserve"> LLM. </w:t>
       </w:r>
     </w:p>
     <w:p>
@@ -5818,7 +6658,7 @@
           <w14:ligatures w14:val="none"/>
         </w:rPr>
       </w:pPr>
-      <w:hyperlink r:id="rId12" w:history="1">
+      <w:hyperlink r:id="rId13" w:history="1">
         <w:r>
           <w:rPr>
             <w:rStyle w:val="Hyperlink"/>
@@ -5961,7 +6801,7 @@
         <w:spacing w:before="100" w:beforeAutospacing="1" w:after="100" w:afterAutospacing="1"/>
         <w:jc w:val="both"/>
       </w:pPr>
-      <w:hyperlink r:id="rId13" w:history="1">
+      <w:hyperlink r:id="rId14" w:history="1">
         <w:r>
           <w:rPr>
             <w:rStyle w:val="Hyperlink"/>
@@ -6167,7 +7007,7 @@
           <w14:ligatures w14:val="none"/>
         </w:rPr>
       </w:pPr>
-      <w:hyperlink r:id="rId14" w:history="1">
+      <w:hyperlink r:id="rId15" w:history="1">
         <w:r>
           <w:rPr>
             <w:rStyle w:val="Hyperlink"/>
@@ -6205,7 +7045,7 @@
         <w:spacing w:before="100" w:beforeAutospacing="1" w:after="100" w:afterAutospacing="1"/>
         <w:jc w:val="both"/>
       </w:pPr>
-      <w:hyperlink r:id="rId15" w:history="1">
+      <w:hyperlink r:id="rId16" w:history="1">
         <w:r>
           <w:rPr>
             <w:rStyle w:val="Hyperlink"/>
@@ -6365,7 +7205,7 @@
                     <pic:cNvPicPr/>
                   </pic:nvPicPr>
                   <pic:blipFill>
-                    <a:blip r:embed="rId16">
+                    <a:blip r:embed="rId17">
                       <a:extLst>
                         <a:ext uri="{28A0092B-C50C-407E-A947-70E740481C1C}">
                           <a14:useLocalDpi xmlns:a14="http://schemas.microsoft.com/office/drawing/2010/main" val="0"/>
@@ -7954,7 +8794,7 @@
           <w14:ligatures w14:val="none"/>
         </w:rPr>
       </w:pPr>
-      <w:hyperlink r:id="rId17" w:history="1">
+      <w:hyperlink r:id="rId18" w:history="1">
         <w:r>
           <w:rPr>
             <w:rStyle w:val="Hyperlink"/>
@@ -8007,7 +8847,7 @@
           <w14:ligatures w14:val="none"/>
         </w:rPr>
       </w:pPr>
-      <w:bookmarkStart w:id="6" w:name="_Toc238269140"/>
+      <w:bookmarkStart w:id="9" w:name="_Toc238527939"/>
       <w:r>
         <w:rPr>
           <w:rFonts w:ascii="Arial" w:hAnsi="Arial"/>
@@ -8059,9 +8899,21 @@
           <w:lang w:eastAsia="en-GB"/>
           <w14:ligatures w14:val="none"/>
         </w:rPr>
-        <w:t xml:space="preserve">: </w:t>
-      </w:r>
-      <w:bookmarkEnd w:id="6"/>
+        <w:t>:</w:t>
+      </w:r>
+      <w:bookmarkEnd w:id="9"/>
+      <w:r>
+        <w:rPr>
+          <w:rFonts w:ascii="Arial" w:eastAsia="Times New Roman" w:hAnsi="Arial" w:cs="Arial"/>
+          <w:color w:val="271A38"/>
+          <w:kern w:val="0"/>
+          <w:sz w:val="24"/>
+          <w:szCs w:val="24"/>
+          <w:lang w:eastAsia="en-GB"/>
+          <w14:ligatures w14:val="none"/>
+        </w:rPr>
+        <w:t xml:space="preserve"> </w:t>
+      </w:r>
     </w:p>
     <w:p>
       <w:pPr>
@@ -10855,7 +11707,7 @@
           <w:lang w:eastAsia="en-GB"/>
         </w:rPr>
       </w:pPr>
-      <w:bookmarkStart w:id="7" w:name="_Toc238269141"/>
+      <w:bookmarkStart w:id="10" w:name="_Toc238527940"/>
       <w:r>
         <w:rPr>
           <w:rFonts w:ascii="Arial" w:eastAsia="Times New Roman" w:hAnsi="Arial"/>
@@ -10874,7 +11726,7 @@
         </w:rPr>
         <w:t xml:space="preserve"> - soft skills</w:t>
       </w:r>
-      <w:bookmarkEnd w:id="7"/>
+      <w:bookmarkEnd w:id="10"/>
       <w:r>
         <w:rPr>
           <w:rFonts w:ascii="Arial" w:eastAsia="Times New Roman" w:hAnsi="Arial"/>
@@ -11142,7 +11994,6 @@
         </w:rPr>
         <w:t>pensée out-of-the-box</w:t>
       </w:r>
-      <w:bookmarkStart w:id="8" w:name="_Toc238269142"/>
       <w:r>
         <w:rPr>
           <w:rFonts w:ascii="Arial" w:eastAsia="Times New Roman" w:hAnsi="Arial" w:cs="Arial"/>
@@ -11201,17 +12052,7 @@
           <w:szCs w:val="22"/>
           <w:lang w:eastAsia="en-GB"/>
         </w:rPr>
-        <w:t>Carte mentale de notre formation</w:t>
-      </w:r>
-      <w:bookmarkEnd w:id="8"/>
-      <w:r>
-        <w:rPr>
-          <w:rFonts w:ascii="Arial" w:hAnsi="Arial"/>
-          <w:sz w:val="22"/>
-          <w:szCs w:val="22"/>
-          <w:lang w:eastAsia="en-GB"/>
-        </w:rPr>
-        <w:t xml:space="preserve"> </w:t>
+        <w:t xml:space="preserve">Carte mentale de notre formation </w:t>
       </w:r>
     </w:p>
     <w:p>
@@ -15260,7 +16101,7 @@
                     <pic:cNvPicPr/>
                   </pic:nvPicPr>
                   <pic:blipFill rotWithShape="1">
-                    <a:blip r:embed="rId18">
+                    <a:blip r:embed="rId19">
                       <a:extLst>
                         <a:ext uri="{28A0092B-C50C-407E-A947-70E740481C1C}">
                           <a14:useLocalDpi xmlns:a14="http://schemas.microsoft.com/office/drawing/2010/main" val="0"/>
@@ -15345,6 +16186,7 @@
           <w:szCs w:val="28"/>
         </w:rPr>
       </w:pPr>
+      <w:bookmarkStart w:id="11" w:name="_Toc238527941"/>
       <w:r>
         <w:rPr>
           <w:rFonts w:ascii="Arial" w:hAnsi="Arial"/>
@@ -15353,6 +16195,7 @@
         </w:rPr>
         <w:t>D - Engagement Éthique et Conformité</w:t>
       </w:r>
+      <w:bookmarkEnd w:id="11"/>
     </w:p>
     <w:p>
       <w:pPr>
@@ -15417,6 +16260,7 @@
           <w:szCs w:val="28"/>
         </w:rPr>
       </w:pPr>
+      <w:bookmarkStart w:id="12" w:name="_Toc238527942"/>
       <w:r>
         <w:rPr>
           <w:sz w:val="28"/>
@@ -15445,6 +16289,7 @@
         </w:rPr>
         <w:t>Conclusion</w:t>
       </w:r>
+      <w:bookmarkEnd w:id="12"/>
     </w:p>
     <w:p/>
     <w:p>
@@ -15484,6 +16329,16 @@
       <w:r>
         <w:t xml:space="preserve"> Je prévois une spécialisation progressive à l’écosystème google cloud.</w:t>
       </w:r>
+    </w:p>
+    <w:p>
+      <w:pPr>
+        <w:jc w:val="both"/>
+      </w:pPr>
+    </w:p>
+    <w:p>
+      <w:pPr>
+        <w:jc w:val="both"/>
+      </w:pPr>
     </w:p>
     <w:p>
       <w:pPr>
@@ -15510,7 +16365,7 @@
 
 <file path=word/comments.xml><?xml version="1.0" encoding="utf-8"?>
 <w:comments xmlns:wpc="http://schemas.microsoft.com/office/word/2010/wordprocessingCanvas" xmlns:cx="http://schemas.microsoft.com/office/drawing/2014/chartex" xmlns:cx1="http://schemas.microsoft.com/office/drawing/2015/9/8/chartex" xmlns:cx2="http://schemas.microsoft.com/office/drawing/2015/10/21/chartex" xmlns:cx3="http://schemas.microsoft.com/office/drawing/2016/5/9/chartex" xmlns:cx4="http://schemas.microsoft.com/office/drawing/2016/5/10/chartex" xmlns:cx5="http://schemas.microsoft.com/office/drawing/2016/5/11/chartex" xmlns:cx6="http://schemas.microsoft.com/office/drawing/2016/5/12/chartex" xmlns:cx7="http://schemas.microsoft.com/office/drawing/2016/5/13/chartex" xmlns:cx8="http://schemas.microsoft.com/office/drawing/2016/5/14/chartex" xmlns:mc="http://schemas.openxmlformats.org/markup-compatibility/2006" xmlns:m="http://schemas.openxmlformats.org/officeDocument/2006/math" xmlns:aink="http://schemas.microsoft.com/office/drawing/2016/ink" xmlns:am3d="http://schemas.microsoft.com/office/drawing/2017/model3d" xmlns:oel="http://schemas.microsoft.com/office/2019/extlst" xmlns:r="http://schemas.openxmlformats.org/officeDocument/2006/relationships" xmlns:wp14="http://schemas.microsoft.com/office/word/2010/wordprocessingDrawing" xmlns:wp="http://schemas.openxmlformats.org/drawingml/2006/wordprocessingDrawing" xmlns:wpg="http://schemas.microsoft.com/office/word/2010/wordprocessingGroup" xmlns:wpi="http://schemas.microsoft.com/office/word/2010/wordprocessingInk" xmlns:wps="http://schemas.microsoft.com/office/word/2010/wordprocessingShape" xmlns:o="urn:schemas-microsoft-com:office:office" xmlns:v="urn:schemas-microsoft-com:vml" xmlns:w10="urn:schemas-microsoft-com:office:word" xmlns:w="http://schemas.openxmlformats.org/wordprocessingml/2006/main" xmlns:w14="http://schemas.microsoft.com/office/word/2010/wordml" xmlns:w15="http://schemas.microsoft.com/office/word/2012/wordml" xmlns:w16cex="http://schemas.microsoft.com/office/word/2018/wordml/cex" xmlns:w16cid="http://schemas.microsoft.com/office/word/2016/wordml/cid" xmlns:w16="http://schemas.microsoft.com/office/word/2018/wordml" xmlns:w16sdtdh="http://schemas.microsoft.com/office/word/2020/wordml/sdtdatahash" xmlns:w16sdtfl="http://schemas.microsoft.com/office/word/2024/wordml/sdtformatlock" xmlns:w16se="http://schemas.microsoft.com/office/word/2015/wordml/symex" xmlns:w16du="http://schemas.microsoft.com/office/word/2023/wordml/word16du" xmlns:wne="http://schemas.microsoft.com/office/word/2006/wordml" mc:Ignorable="w14 w15 w16se w16cid w16 w16cex w16sdtdh w16sdtfl w16du wp14">
-  <w:comment w:id="2" w:author="Christophe Mpaga" w:date="2026-08-14T12:10:00Z" w:initials="CM">
+  <w:comment w:id="4" w:author="Christophe Mpaga" w:date="2026-08-14T12:10:00Z" w:initials="CM">
     <w:p>
       <w:r>
         <w:rPr>
@@ -15551,9 +16406,9 @@
 <file path=word/numbering.xml><?xml version="1.0" encoding="utf-8"?>
 <w:numbering xmlns:wpc="http://schemas.microsoft.com/office/word/2010/wordprocessingCanvas" xmlns:cx="http://schemas.microsoft.com/office/drawing/2014/chartex" xmlns:cx1="http://schemas.microsoft.com/office/drawing/2015/9/8/chartex" xmlns:cx2="http://schemas.microsoft.com/office/drawing/2015/10/21/chartex" xmlns:cx3="http://schemas.microsoft.com/office/drawing/2016/5/9/chartex" xmlns:cx4="http://schemas.microsoft.com/office/drawing/2016/5/10/chartex" xmlns:cx5="http://schemas.microsoft.com/office/drawing/2016/5/11/chartex" xmlns:cx6="http://schemas.microsoft.com/office/drawing/2016/5/12/chartex" xmlns:cx7="http://schemas.microsoft.com/office/drawing/2016/5/13/chartex" xmlns:cx8="http://schemas.microsoft.com/office/drawing/2016/5/14/chartex" xmlns:mc="http://schemas.openxmlformats.org/markup-compatibility/2006" xmlns:m="http://schemas.openxmlformats.org/officeDocument/2006/math" xmlns:aink="http://schemas.microsoft.com/office/drawing/2016/ink" xmlns:am3d="http://schemas.microsoft.com/office/drawing/2017/model3d" xmlns:oel="http://schemas.microsoft.com/office/2019/extlst" xmlns:r="http://schemas.openxmlformats.org/officeDocument/2006/relationships" xmlns:wp14="http://schemas.microsoft.com/office/word/2010/wordprocessingDrawing" xmlns:wp="http://schemas.openxmlformats.org/drawingml/2006/wordprocessingDrawing" xmlns:wpg="http://schemas.microsoft.com/office/word/2010/wordprocessingGroup" xmlns:wpi="http://schemas.microsoft.com/office/word/2010/wordprocessingInk" xmlns:wps="http://schemas.microsoft.com/office/word/2010/wordprocessingShape" xmlns:o="urn:schemas-microsoft-com:office:office" xmlns:v="urn:schemas-microsoft-com:vml" xmlns:w10="urn:schemas-microsoft-com:office:word" xmlns:w="http://schemas.openxmlformats.org/wordprocessingml/2006/main" xmlns:w14="http://schemas.microsoft.com/office/word/2010/wordml" xmlns:w15="http://schemas.microsoft.com/office/word/2012/wordml" xmlns:w16cex="http://schemas.microsoft.com/office/word/2018/wordml/cex" xmlns:w16cid="http://schemas.microsoft.com/office/word/2016/wordml/cid" xmlns:w16="http://schemas.microsoft.com/office/word/2018/wordml" xmlns:w16sdtdh="http://schemas.microsoft.com/office/word/2020/wordml/sdtdatahash" xmlns:w16sdtfl="http://schemas.microsoft.com/office/word/2024/wordml/sdtformatlock" xmlns:w16se="http://schemas.microsoft.com/office/word/2015/wordml/symex" xmlns:w16du="http://schemas.microsoft.com/office/word/2023/wordml/word16du" xmlns:wne="http://schemas.microsoft.com/office/word/2006/wordml" mc:Ignorable="w14 w15 w16se w16cid w16 w16cex w16sdtdh w16sdtfl w16du wp14">
   <w:abstractNum w:abstractNumId="0" w15:restartNumberingAfterBreak="0">
-    <w:nsid w:val="0CC76D79"/>
+    <w:nsid w:val="04183C68"/>
     <w:multiLevelType w:val="hybridMultilevel"/>
-    <w:tmpl w:val="069CF0BC"/>
+    <w:tmpl w:val="6B6C8EFA"/>
     <w:lvl w:ilvl="0" w:tplc="0809000F">
       <w:start w:val="1"/>
       <w:numFmt w:val="decimal"/>
@@ -15640,6 +16495,95 @@
     </w:lvl>
   </w:abstractNum>
   <w:abstractNum w:abstractNumId="1" w15:restartNumberingAfterBreak="0">
+    <w:nsid w:val="0CC76D79"/>
+    <w:multiLevelType w:val="hybridMultilevel"/>
+    <w:tmpl w:val="069CF0BC"/>
+    <w:lvl w:ilvl="0" w:tplc="0809000F">
+      <w:start w:val="1"/>
+      <w:numFmt w:val="decimal"/>
+      <w:lvlText w:val="%1."/>
+      <w:lvlJc w:val="left"/>
+      <w:pPr>
+        <w:ind w:left="720" w:hanging="360"/>
+      </w:pPr>
+      <w:rPr>
+        <w:rFonts w:hint="default"/>
+      </w:rPr>
+    </w:lvl>
+    <w:lvl w:ilvl="1" w:tplc="08090019" w:tentative="1">
+      <w:start w:val="1"/>
+      <w:numFmt w:val="lowerLetter"/>
+      <w:lvlText w:val="%2."/>
+      <w:lvlJc w:val="left"/>
+      <w:pPr>
+        <w:ind w:left="1440" w:hanging="360"/>
+      </w:pPr>
+    </w:lvl>
+    <w:lvl w:ilvl="2" w:tplc="0809001B" w:tentative="1">
+      <w:start w:val="1"/>
+      <w:numFmt w:val="lowerRoman"/>
+      <w:lvlText w:val="%3."/>
+      <w:lvlJc w:val="right"/>
+      <w:pPr>
+        <w:ind w:left="2160" w:hanging="180"/>
+      </w:pPr>
+    </w:lvl>
+    <w:lvl w:ilvl="3" w:tplc="0809000F" w:tentative="1">
+      <w:start w:val="1"/>
+      <w:numFmt w:val="decimal"/>
+      <w:lvlText w:val="%4."/>
+      <w:lvlJc w:val="left"/>
+      <w:pPr>
+        <w:ind w:left="2880" w:hanging="360"/>
+      </w:pPr>
+    </w:lvl>
+    <w:lvl w:ilvl="4" w:tplc="08090019" w:tentative="1">
+      <w:start w:val="1"/>
+      <w:numFmt w:val="lowerLetter"/>
+      <w:lvlText w:val="%5."/>
+      <w:lvlJc w:val="left"/>
+      <w:pPr>
+        <w:ind w:left="3600" w:hanging="360"/>
+      </w:pPr>
+    </w:lvl>
+    <w:lvl w:ilvl="5" w:tplc="0809001B" w:tentative="1">
+      <w:start w:val="1"/>
+      <w:numFmt w:val="lowerRoman"/>
+      <w:lvlText w:val="%6."/>
+      <w:lvlJc w:val="right"/>
+      <w:pPr>
+        <w:ind w:left="4320" w:hanging="180"/>
+      </w:pPr>
+    </w:lvl>
+    <w:lvl w:ilvl="6" w:tplc="0809000F" w:tentative="1">
+      <w:start w:val="1"/>
+      <w:numFmt w:val="decimal"/>
+      <w:lvlText w:val="%7."/>
+      <w:lvlJc w:val="left"/>
+      <w:pPr>
+        <w:ind w:left="5040" w:hanging="360"/>
+      </w:pPr>
+    </w:lvl>
+    <w:lvl w:ilvl="7" w:tplc="08090019" w:tentative="1">
+      <w:start w:val="1"/>
+      <w:numFmt w:val="lowerLetter"/>
+      <w:lvlText w:val="%8."/>
+      <w:lvlJc w:val="left"/>
+      <w:pPr>
+        <w:ind w:left="5760" w:hanging="360"/>
+      </w:pPr>
+    </w:lvl>
+    <w:lvl w:ilvl="8" w:tplc="0809001B" w:tentative="1">
+      <w:start w:val="1"/>
+      <w:numFmt w:val="lowerRoman"/>
+      <w:lvlText w:val="%9."/>
+      <w:lvlJc w:val="right"/>
+      <w:pPr>
+        <w:ind w:left="6480" w:hanging="180"/>
+      </w:pPr>
+    </w:lvl>
+  </w:abstractNum>
+  <w:abstractNum w:abstractNumId="2" w15:restartNumberingAfterBreak="0">
     <w:nsid w:val="0F294D5E"/>
     <w:multiLevelType w:val="multilevel"/>
     <w:tmpl w:val="A01CFD70"/>
@@ -15788,7 +16732,7 @@
       </w:rPr>
     </w:lvl>
   </w:abstractNum>
-  <w:abstractNum w:abstractNumId="2" w15:restartNumberingAfterBreak="0">
+  <w:abstractNum w:abstractNumId="3" w15:restartNumberingAfterBreak="0">
     <w:nsid w:val="0F607587"/>
     <w:multiLevelType w:val="multilevel"/>
     <w:tmpl w:val="08090021"/>
@@ -15901,7 +16845,7 @@
       </w:rPr>
     </w:lvl>
   </w:abstractNum>
-  <w:abstractNum w:abstractNumId="3" w15:restartNumberingAfterBreak="0">
+  <w:abstractNum w:abstractNumId="4" w15:restartNumberingAfterBreak="0">
     <w:nsid w:val="2BC31AD5"/>
     <w:multiLevelType w:val="hybridMultilevel"/>
     <w:tmpl w:val="7108CF8C"/>
@@ -15990,7 +16934,7 @@
       </w:pPr>
     </w:lvl>
   </w:abstractNum>
-  <w:abstractNum w:abstractNumId="4" w15:restartNumberingAfterBreak="0">
+  <w:abstractNum w:abstractNumId="5" w15:restartNumberingAfterBreak="0">
     <w:nsid w:val="3D005CA5"/>
     <w:multiLevelType w:val="hybridMultilevel"/>
     <w:tmpl w:val="33DE572A"/>
@@ -16079,7 +17023,96 @@
       </w:pPr>
     </w:lvl>
   </w:abstractNum>
-  <w:abstractNum w:abstractNumId="5" w15:restartNumberingAfterBreak="0">
+  <w:abstractNum w:abstractNumId="6" w15:restartNumberingAfterBreak="0">
+    <w:nsid w:val="4EB71742"/>
+    <w:multiLevelType w:val="hybridMultilevel"/>
+    <w:tmpl w:val="78CA6A56"/>
+    <w:lvl w:ilvl="0" w:tplc="0809000F">
+      <w:start w:val="1"/>
+      <w:numFmt w:val="decimal"/>
+      <w:lvlText w:val="%1."/>
+      <w:lvlJc w:val="left"/>
+      <w:pPr>
+        <w:ind w:left="720" w:hanging="360"/>
+      </w:pPr>
+      <w:rPr>
+        <w:rFonts w:hint="default"/>
+      </w:rPr>
+    </w:lvl>
+    <w:lvl w:ilvl="1" w:tplc="08090019" w:tentative="1">
+      <w:start w:val="1"/>
+      <w:numFmt w:val="lowerLetter"/>
+      <w:lvlText w:val="%2."/>
+      <w:lvlJc w:val="left"/>
+      <w:pPr>
+        <w:ind w:left="1440" w:hanging="360"/>
+      </w:pPr>
+    </w:lvl>
+    <w:lvl w:ilvl="2" w:tplc="0809001B" w:tentative="1">
+      <w:start w:val="1"/>
+      <w:numFmt w:val="lowerRoman"/>
+      <w:lvlText w:val="%3."/>
+      <w:lvlJc w:val="right"/>
+      <w:pPr>
+        <w:ind w:left="2160" w:hanging="180"/>
+      </w:pPr>
+    </w:lvl>
+    <w:lvl w:ilvl="3" w:tplc="0809000F" w:tentative="1">
+      <w:start w:val="1"/>
+      <w:numFmt w:val="decimal"/>
+      <w:lvlText w:val="%4."/>
+      <w:lvlJc w:val="left"/>
+      <w:pPr>
+        <w:ind w:left="2880" w:hanging="360"/>
+      </w:pPr>
+    </w:lvl>
+    <w:lvl w:ilvl="4" w:tplc="08090019" w:tentative="1">
+      <w:start w:val="1"/>
+      <w:numFmt w:val="lowerLetter"/>
+      <w:lvlText w:val="%5."/>
+      <w:lvlJc w:val="left"/>
+      <w:pPr>
+        <w:ind w:left="3600" w:hanging="360"/>
+      </w:pPr>
+    </w:lvl>
+    <w:lvl w:ilvl="5" w:tplc="0809001B" w:tentative="1">
+      <w:start w:val="1"/>
+      <w:numFmt w:val="lowerRoman"/>
+      <w:lvlText w:val="%6."/>
+      <w:lvlJc w:val="right"/>
+      <w:pPr>
+        <w:ind w:left="4320" w:hanging="180"/>
+      </w:pPr>
+    </w:lvl>
+    <w:lvl w:ilvl="6" w:tplc="0809000F" w:tentative="1">
+      <w:start w:val="1"/>
+      <w:numFmt w:val="decimal"/>
+      <w:lvlText w:val="%7."/>
+      <w:lvlJc w:val="left"/>
+      <w:pPr>
+        <w:ind w:left="5040" w:hanging="360"/>
+      </w:pPr>
+    </w:lvl>
+    <w:lvl w:ilvl="7" w:tplc="08090019" w:tentative="1">
+      <w:start w:val="1"/>
+      <w:numFmt w:val="lowerLetter"/>
+      <w:lvlText w:val="%8."/>
+      <w:lvlJc w:val="left"/>
+      <w:pPr>
+        <w:ind w:left="5760" w:hanging="360"/>
+      </w:pPr>
+    </w:lvl>
+    <w:lvl w:ilvl="8" w:tplc="0809001B" w:tentative="1">
+      <w:start w:val="1"/>
+      <w:numFmt w:val="lowerRoman"/>
+      <w:lvlText w:val="%9."/>
+      <w:lvlJc w:val="right"/>
+      <w:pPr>
+        <w:ind w:left="6480" w:hanging="180"/>
+      </w:pPr>
+    </w:lvl>
+  </w:abstractNum>
+  <w:abstractNum w:abstractNumId="7" w15:restartNumberingAfterBreak="0">
     <w:nsid w:val="6B044E84"/>
     <w:multiLevelType w:val="hybridMultilevel"/>
     <w:tmpl w:val="A10A7F0A"/>
@@ -16192,7 +17225,7 @@
       </w:rPr>
     </w:lvl>
   </w:abstractNum>
-  <w:abstractNum w:abstractNumId="6" w15:restartNumberingAfterBreak="0">
+  <w:abstractNum w:abstractNumId="8" w15:restartNumberingAfterBreak="0">
     <w:nsid w:val="7B4975FD"/>
     <w:multiLevelType w:val="hybridMultilevel"/>
     <w:tmpl w:val="746231D6"/>
@@ -16333,25 +17366,31 @@
     </w:lvl>
   </w:abstractNum>
   <w:num w:numId="1" w16cid:durableId="498421387">
-    <w:abstractNumId w:val="0"/>
+    <w:abstractNumId w:val="1"/>
   </w:num>
   <w:num w:numId="2" w16cid:durableId="1801916878">
+    <w:abstractNumId w:val="7"/>
+  </w:num>
+  <w:num w:numId="3" w16cid:durableId="589432480">
+    <w:abstractNumId w:val="2"/>
+  </w:num>
+  <w:num w:numId="4" w16cid:durableId="1116749339">
+    <w:abstractNumId w:val="4"/>
+  </w:num>
+  <w:num w:numId="5" w16cid:durableId="472794143">
     <w:abstractNumId w:val="5"/>
   </w:num>
-  <w:num w:numId="3" w16cid:durableId="589432480">
-    <w:abstractNumId w:val="1"/>
-  </w:num>
-  <w:num w:numId="4" w16cid:durableId="1116749339">
+  <w:num w:numId="6" w16cid:durableId="1558663043">
     <w:abstractNumId w:val="3"/>
   </w:num>
-  <w:num w:numId="5" w16cid:durableId="472794143">
-    <w:abstractNumId w:val="4"/>
+  <w:num w:numId="7" w16cid:durableId="724178811">
+    <w:abstractNumId w:val="8"/>
   </w:num>
-  <w:num w:numId="6" w16cid:durableId="1558663043">
-    <w:abstractNumId w:val="2"/>
+  <w:num w:numId="8" w16cid:durableId="50155296">
+    <w:abstractNumId w:val="6"/>
   </w:num>
-  <w:num w:numId="7" w16cid:durableId="724178811">
-    <w:abstractNumId w:val="6"/>
+  <w:num w:numId="9" w16cid:durableId="557590755">
+    <w:abstractNumId w:val="0"/>
   </w:num>
 </w:numbering>
 </file>
@@ -16959,6 +17998,7 @@
   <w:style w:type="character" w:default="1" w:styleId="DefaultParagraphFont">
     <w:name w:val="Default Paragraph Font"/>
     <w:uiPriority w:val="1"/>
+    <w:semiHidden/>
     <w:unhideWhenUsed/>
   </w:style>
   <w:style w:type="table" w:default="1" w:styleId="TableNormal">

</xml_diff>